<commit_message>
Aire Express setter: where to read the lead's answers and the Meta form call script
Adds the Additional Info fields (service, emergency, stories, basement,
chimney, page fields) to the school and Speech 01, plus the call script for
form leads that already answered 3 of the 4 replacement questions.

Co-Authored-By: Claude Opus 5.5 <noreply@anthropic.com>
</commit_message>
<xml_diff>
--- a/induccion-aire-express/guiones/docs/01_SPEECH_CONTACTABILIDAD.docx
+++ b/induccion-aire-express/guiones/docs/01_SPEECH_CONTACTABILIDAD.docx
@@ -736,7 +736,7 @@
           <w:sz w:val="20"/>
           <w:szCs w:val="20"/>
         </w:rPr>
-        <w:t xml:space="preserve">Antes de marcar, mira en la app: </w:t>
+        <w:t xml:space="preserve">Antes de marcar, mira en la app lo que el cliente ya respondió. </w:t>
       </w:r>
       <w:r>
         <w:rPr>
@@ -747,16 +747,7 @@
           <w:sz w:val="20"/>
           <w:szCs w:val="20"/>
         </w:rPr>
-        <w:t xml:space="preserve">proyecto, detalle, plazo, urgencia, ciudad y mensaje</w:t>
-      </w:r>
-      <w:r>
-        <w:rPr>
-          <w:rFonts w:ascii="Arial" w:cs="Arial" w:eastAsia="Arial" w:hAnsi="Arial"/>
-          <w:color w:val="333333"/>
-          <w:sz w:val="20"/>
-          <w:szCs w:val="20"/>
-        </w:rPr>
-        <w:t xml:space="preserve">.</w:t>
+        <w:t xml:space="preserve">Lo que ya respondió no se vuelve a preguntar.</w:t>
       </w:r>
     </w:p>
     <w:p>
@@ -772,16 +763,16 @@
           <w:sz w:val="20"/>
           <w:szCs w:val="20"/>
         </w:rPr>
-        <w:t xml:space="preserve">Furnace — REEMPLAZO (ya tiene un furnace y lo quiere cambiar) — se cotiza por teléfono (Juan David, 15-oct):</w:t>
-      </w:r>
-      <w:r>
-        <w:rPr>
-          <w:rFonts w:ascii="Arial" w:cs="Arial" w:eastAsia="Arial" w:hAnsi="Arial"/>
-          <w:color w:val="333333"/>
-          <w:sz w:val="20"/>
-          <w:szCs w:val="20"/>
-        </w:rPr>
-        <w:t xml:space="preserve"> Si es </w:t>
+        <w:t xml:space="preserve">Dónde lo ves (computador):</w:t>
+      </w:r>
+      <w:r>
+        <w:rPr>
+          <w:rFonts w:ascii="Arial" w:cs="Arial" w:eastAsia="Arial" w:hAnsi="Arial"/>
+          <w:color w:val="333333"/>
+          <w:sz w:val="20"/>
+          <w:szCs w:val="20"/>
+        </w:rPr>
+        <w:t xml:space="preserve"> abre el contacto → columna izquierda </w:t>
       </w:r>
       <w:r>
         <w:rPr>
@@ -792,16 +783,16 @@
           <w:sz w:val="20"/>
           <w:szCs w:val="20"/>
         </w:rPr>
-        <w:t xml:space="preserve">instalación nueva</w:t>
-      </w:r>
-      <w:r>
-        <w:rPr>
-          <w:rFonts w:ascii="Arial" w:cs="Arial" w:eastAsia="Arial" w:hAnsi="Arial"/>
-          <w:color w:val="333333"/>
-          <w:sz w:val="20"/>
-          <w:szCs w:val="20"/>
-        </w:rPr>
-        <w:t xml:space="preserve"> (la casa no tiene furnace), no uses este bloque: ve a "Furnace — INSTALACIÓN NUEVA" más abajo. Antes de marcar, mira si el lead ya trae los datos de la casa (el formulario de Meta pregunta pisos, basement y chimenea). Lo que ya respondió </w:t>
+        <w:t xml:space="preserve">Contact Details</w:t>
+      </w:r>
+      <w:r>
+        <w:rPr>
+          <w:rFonts w:ascii="Arial" w:cs="Arial" w:eastAsia="Arial" w:hAnsi="Arial"/>
+          <w:color w:val="333333"/>
+          <w:sz w:val="20"/>
+          <w:szCs w:val="20"/>
+        </w:rPr>
+        <w:t xml:space="preserve"> → pestaña </w:t>
       </w:r>
       <w:r>
         <w:rPr>
@@ -812,16 +803,1690 @@
           <w:sz w:val="20"/>
           <w:szCs w:val="20"/>
         </w:rPr>
-        <w:t xml:space="preserve">no se vuelve a preguntar</w:t>
-      </w:r>
-      <w:r>
-        <w:rPr>
-          <w:rFonts w:ascii="Arial" w:cs="Arial" w:eastAsia="Arial" w:hAnsi="Arial"/>
-          <w:color w:val="333333"/>
-          <w:sz w:val="20"/>
-          <w:szCs w:val="20"/>
-        </w:rPr>
-        <w:t xml:space="preserve">.</w:t>
+        <w:t xml:space="preserve">All fields</w:t>
+      </w:r>
+      <w:r>
+        <w:rPr>
+          <w:rFonts w:ascii="Arial" w:cs="Arial" w:eastAsia="Arial" w:hAnsi="Arial"/>
+          <w:color w:val="333333"/>
+          <w:sz w:val="20"/>
+          <w:szCs w:val="20"/>
+        </w:rPr>
+        <w:t xml:space="preserve"> → abre la carpeta </w:t>
+      </w:r>
+      <w:r>
+        <w:rPr>
+          <w:rFonts w:ascii="Arial" w:cs="Arial" w:eastAsia="Arial" w:hAnsi="Arial"/>
+          <w:b/>
+          <w:bCs/>
+          <w:color w:val="333333"/>
+          <w:sz w:val="20"/>
+          <w:szCs w:val="20"/>
+        </w:rPr>
+        <w:t xml:space="preserve">Additional Info</w:t>
+      </w:r>
+      <w:r>
+        <w:rPr>
+          <w:rFonts w:ascii="Arial" w:cs="Arial" w:eastAsia="Arial" w:hAnsi="Arial"/>
+          <w:color w:val="333333"/>
+          <w:sz w:val="20"/>
+          <w:szCs w:val="20"/>
+        </w:rPr>
+        <w:t xml:space="preserve"> (está al final, debajo de *General Info*). </w:t>
+      </w:r>
+      <w:r>
+        <w:rPr>
+          <w:rFonts w:ascii="Arial" w:cs="Arial" w:eastAsia="Arial" w:hAnsi="Arial"/>
+          <w:b/>
+          <w:bCs/>
+          <w:color w:val="333333"/>
+          <w:sz w:val="20"/>
+          <w:szCs w:val="20"/>
+        </w:rPr>
+        <w:t xml:space="preserve">Celular:</w:t>
+      </w:r>
+      <w:r>
+        <w:rPr>
+          <w:rFonts w:ascii="Arial" w:cs="Arial" w:eastAsia="Arial" w:hAnsi="Arial"/>
+          <w:color w:val="333333"/>
+          <w:sz w:val="20"/>
+          <w:szCs w:val="20"/>
+        </w:rPr>
+        <w:t xml:space="preserve"> Conversations → el chat → *Tap to view Contact info* → pestaña </w:t>
+      </w:r>
+      <w:r>
+        <w:rPr>
+          <w:rFonts w:ascii="Arial" w:cs="Arial" w:eastAsia="Arial" w:hAnsi="Arial"/>
+          <w:b/>
+          <w:bCs/>
+          <w:color w:val="333333"/>
+          <w:sz w:val="20"/>
+          <w:szCs w:val="20"/>
+        </w:rPr>
+        <w:t xml:space="preserve">Details</w:t>
+      </w:r>
+      <w:r>
+        <w:rPr>
+          <w:rFonts w:ascii="Arial" w:cs="Arial" w:eastAsia="Arial" w:hAnsi="Arial"/>
+          <w:color w:val="333333"/>
+          <w:sz w:val="20"/>
+          <w:szCs w:val="20"/>
+        </w:rPr>
+        <w:t xml:space="preserve">. Arriba de la ficha también ves la etiqueta de dónde llegó: </w:t>
+      </w:r>
+      <w:r>
+        <w:rPr>
+          <w:rFonts w:ascii="Courier New" w:cs="Courier New" w:eastAsia="Courier New" w:hAnsi="Courier New"/>
+          <w:color w:val="333333"/>
+          <w:sz w:val="18"/>
+          <w:szCs w:val="18"/>
+        </w:rPr>
+        <w:t xml:space="preserve">origen-formulario-meta</w:t>
+      </w:r>
+      <w:r>
+        <w:rPr>
+          <w:rFonts w:ascii="Arial" w:cs="Arial" w:eastAsia="Arial" w:hAnsi="Arial"/>
+          <w:color w:val="333333"/>
+          <w:sz w:val="20"/>
+          <w:szCs w:val="20"/>
+        </w:rPr>
+        <w:t xml:space="preserve"> (formulario de Facebook/Instagram) o </w:t>
+      </w:r>
+      <w:r>
+        <w:rPr>
+          <w:rFonts w:ascii="Courier New" w:cs="Courier New" w:eastAsia="Courier New" w:hAnsi="Courier New"/>
+          <w:color w:val="333333"/>
+          <w:sz w:val="18"/>
+          <w:szCs w:val="18"/>
+        </w:rPr>
+        <w:t xml:space="preserve">origen-sitio</w:t>
+      </w:r>
+      <w:r>
+        <w:rPr>
+          <w:rFonts w:ascii="Arial" w:cs="Arial" w:eastAsia="Arial" w:hAnsi="Arial"/>
+          <w:color w:val="333333"/>
+          <w:sz w:val="20"/>
+          <w:szCs w:val="20"/>
+        </w:rPr>
+        <w:t xml:space="preserve"> (página web).</w:t>
+      </w:r>
+    </w:p>
+    <w:tbl>
+      <w:tblPr>
+        <w:tblW w:type="dxa" w:w="9972"/>
+        <w:tblBorders>
+          <w:top w:val="single" w:color="auto" w:sz="4"/>
+          <w:left w:val="single" w:color="auto" w:sz="4"/>
+          <w:bottom w:val="single" w:color="auto" w:sz="4"/>
+          <w:right w:val="single" w:color="auto" w:sz="4"/>
+          <w:insideH w:val="single" w:color="auto" w:sz="4"/>
+          <w:insideV w:val="single" w:color="auto" w:sz="4"/>
+        </w:tblBorders>
+      </w:tblPr>
+      <w:tblGrid>
+        <w:gridCol w:w="2920"/>
+        <w:gridCol w:w="4546"/>
+        <w:gridCol w:w="2506"/>
+      </w:tblGrid>
+      <w:tr>
+        <w:trPr>
+          <w:tblHeader/>
+        </w:trPr>
+        <w:tc>
+          <w:tcPr>
+            <w:tcW w:type="dxa" w:w="2920"/>
+            <w:tcBorders>
+              <w:top w:val="single" w:color="CCCCCC" w:sz="1"/>
+              <w:left w:val="single" w:color="CCCCCC" w:sz="1"/>
+              <w:bottom w:val="single" w:color="CCCCCC" w:sz="1"/>
+              <w:right w:val="single" w:color="CCCCCC" w:sz="1"/>
+            </w:tcBorders>
+            <w:shd w:fill="1B2A4A" w:val="clear"/>
+            <w:tcMar>
+              <w:top w:type="dxa" w:w="70"/>
+              <w:left w:type="dxa" w:w="100"/>
+              <w:bottom w:type="dxa" w:w="70"/>
+              <w:right w:type="dxa" w:w="100"/>
+            </w:tcMar>
+          </w:tcPr>
+          <w:p>
+            <w:pPr>
+              <w:spacing w:after="0"/>
+              <w:jc w:val="left"/>
+            </w:pPr>
+            <w:r>
+              <w:rPr>
+                <w:rFonts w:ascii="Arial" w:cs="Arial" w:eastAsia="Arial" w:hAnsi="Arial"/>
+                <w:b/>
+                <w:bCs/>
+                <w:color w:val="FFFFFF"/>
+                <w:sz w:val="18"/>
+                <w:szCs w:val="18"/>
+              </w:rPr>
+              <w:t xml:space="preserve">Campo en la app</w:t>
+            </w:r>
+          </w:p>
+        </w:tc>
+        <w:tc>
+          <w:tcPr>
+            <w:tcW w:type="dxa" w:w="4546"/>
+            <w:tcBorders>
+              <w:top w:val="single" w:color="CCCCCC" w:sz="1"/>
+              <w:left w:val="single" w:color="CCCCCC" w:sz="1"/>
+              <w:bottom w:val="single" w:color="CCCCCC" w:sz="1"/>
+              <w:right w:val="single" w:color="CCCCCC" w:sz="1"/>
+            </w:tcBorders>
+            <w:shd w:fill="1B2A4A" w:val="clear"/>
+            <w:tcMar>
+              <w:top w:type="dxa" w:w="70"/>
+              <w:left w:type="dxa" w:w="100"/>
+              <w:bottom w:type="dxa" w:w="70"/>
+              <w:right w:type="dxa" w:w="100"/>
+            </w:tcMar>
+          </w:tcPr>
+          <w:p>
+            <w:pPr>
+              <w:spacing w:after="0"/>
+              <w:jc w:val="left"/>
+            </w:pPr>
+            <w:r>
+              <w:rPr>
+                <w:rFonts w:ascii="Arial" w:cs="Arial" w:eastAsia="Arial" w:hAnsi="Arial"/>
+                <w:b/>
+                <w:bCs/>
+                <w:color w:val="FFFFFF"/>
+                <w:sz w:val="18"/>
+                <w:szCs w:val="18"/>
+              </w:rPr>
+              <w:t xml:space="preserve">Qué te dice</w:t>
+            </w:r>
+          </w:p>
+        </w:tc>
+        <w:tc>
+          <w:tcPr>
+            <w:tcW w:type="dxa" w:w="2506"/>
+            <w:tcBorders>
+              <w:top w:val="single" w:color="CCCCCC" w:sz="1"/>
+              <w:left w:val="single" w:color="CCCCCC" w:sz="1"/>
+              <w:bottom w:val="single" w:color="CCCCCC" w:sz="1"/>
+              <w:right w:val="single" w:color="CCCCCC" w:sz="1"/>
+            </w:tcBorders>
+            <w:shd w:fill="1B2A4A" w:val="clear"/>
+            <w:tcMar>
+              <w:top w:type="dxa" w:w="70"/>
+              <w:left w:type="dxa" w:w="100"/>
+              <w:bottom w:type="dxa" w:w="70"/>
+              <w:right w:type="dxa" w:w="100"/>
+            </w:tcMar>
+          </w:tcPr>
+          <w:p>
+            <w:pPr>
+              <w:spacing w:after="0"/>
+              <w:jc w:val="left"/>
+            </w:pPr>
+            <w:r>
+              <w:rPr>
+                <w:rFonts w:ascii="Arial" w:cs="Arial" w:eastAsia="Arial" w:hAnsi="Arial"/>
+                <w:b/>
+                <w:bCs/>
+                <w:color w:val="FFFFFF"/>
+                <w:sz w:val="18"/>
+                <w:szCs w:val="18"/>
+              </w:rPr>
+              <w:t xml:space="preserve">De dónde viene</w:t>
+            </w:r>
+          </w:p>
+        </w:tc>
+      </w:tr>
+      <w:tr>
+        <w:trPr>
+          <w:cantSplit/>
+        </w:trPr>
+        <w:tc>
+          <w:tcPr>
+            <w:tcW w:type="dxa" w:w="2920"/>
+            <w:tcBorders>
+              <w:top w:val="single" w:color="CCCCCC" w:sz="1"/>
+              <w:left w:val="single" w:color="CCCCCC" w:sz="1"/>
+              <w:bottom w:val="single" w:color="CCCCCC" w:sz="1"/>
+              <w:right w:val="single" w:color="CCCCCC" w:sz="1"/>
+            </w:tcBorders>
+            <w:shd w:fill="F7F8FA" w:val="clear"/>
+            <w:tcMar>
+              <w:top w:type="dxa" w:w="70"/>
+              <w:left w:type="dxa" w:w="100"/>
+              <w:bottom w:type="dxa" w:w="70"/>
+              <w:right w:type="dxa" w:w="100"/>
+            </w:tcMar>
+          </w:tcPr>
+          <w:p>
+            <w:pPr>
+              <w:spacing w:after="0"/>
+            </w:pPr>
+            <w:r>
+              <w:rPr>
+                <w:rFonts w:ascii="Courier New" w:cs="Courier New" w:eastAsia="Courier New" w:hAnsi="Courier New"/>
+                <w:color w:val="333333"/>
+                <w:sz w:val="15"/>
+                <w:szCs w:val="15"/>
+              </w:rPr>
+              <w:t xml:space="preserve">servicio</w:t>
+            </w:r>
+          </w:p>
+        </w:tc>
+        <w:tc>
+          <w:tcPr>
+            <w:tcW w:type="dxa" w:w="4546"/>
+            <w:tcBorders>
+              <w:top w:val="single" w:color="CCCCCC" w:sz="1"/>
+              <w:left w:val="single" w:color="CCCCCC" w:sz="1"/>
+              <w:bottom w:val="single" w:color="CCCCCC" w:sz="1"/>
+              <w:right w:val="single" w:color="CCCCCC" w:sz="1"/>
+            </w:tcBorders>
+            <w:shd w:fill="F7F8FA" w:val="clear"/>
+            <w:tcMar>
+              <w:top w:type="dxa" w:w="70"/>
+              <w:left w:type="dxa" w:w="100"/>
+              <w:bottom w:type="dxa" w:w="70"/>
+              <w:right w:type="dxa" w:w="100"/>
+            </w:tcMar>
+          </w:tcPr>
+          <w:p>
+            <w:pPr>
+              <w:spacing w:after="0"/>
+            </w:pPr>
+            <w:r>
+              <w:rPr>
+                <w:rFonts w:ascii="Arial" w:cs="Arial" w:eastAsia="Arial" w:hAnsi="Arial"/>
+                <w:color w:val="333333"/>
+                <w:sz w:val="17"/>
+                <w:szCs w:val="17"/>
+              </w:rPr>
+              <w:t xml:space="preserve">Qué pidió (ej. *Furnace replacement*, *New furnace*, *Repair*)</w:t>
+            </w:r>
+          </w:p>
+        </w:tc>
+        <w:tc>
+          <w:tcPr>
+            <w:tcW w:type="dxa" w:w="2506"/>
+            <w:tcBorders>
+              <w:top w:val="single" w:color="CCCCCC" w:sz="1"/>
+              <w:left w:val="single" w:color="CCCCCC" w:sz="1"/>
+              <w:bottom w:val="single" w:color="CCCCCC" w:sz="1"/>
+              <w:right w:val="single" w:color="CCCCCC" w:sz="1"/>
+            </w:tcBorders>
+            <w:shd w:fill="F7F8FA" w:val="clear"/>
+            <w:tcMar>
+              <w:top w:type="dxa" w:w="70"/>
+              <w:left w:type="dxa" w:w="100"/>
+              <w:bottom w:type="dxa" w:w="70"/>
+              <w:right w:type="dxa" w:w="100"/>
+            </w:tcMar>
+          </w:tcPr>
+          <w:p>
+            <w:pPr>
+              <w:spacing w:after="0"/>
+            </w:pPr>
+            <w:r>
+              <w:rPr>
+                <w:rFonts w:ascii="Arial" w:cs="Arial" w:eastAsia="Arial" w:hAnsi="Arial"/>
+                <w:color w:val="333333"/>
+                <w:sz w:val="17"/>
+                <w:szCs w:val="17"/>
+              </w:rPr>
+              <w:t xml:space="preserve">Formulario y página</w:t>
+            </w:r>
+          </w:p>
+        </w:tc>
+      </w:tr>
+      <w:tr>
+        <w:trPr>
+          <w:cantSplit/>
+        </w:trPr>
+        <w:tc>
+          <w:tcPr>
+            <w:tcW w:type="dxa" w:w="2920"/>
+            <w:tcBorders>
+              <w:top w:val="single" w:color="CCCCCC" w:sz="1"/>
+              <w:left w:val="single" w:color="CCCCCC" w:sz="1"/>
+              <w:bottom w:val="single" w:color="CCCCCC" w:sz="1"/>
+              <w:right w:val="single" w:color="CCCCCC" w:sz="1"/>
+            </w:tcBorders>
+            <w:shd w:fill="FFFFFF" w:val="clear"/>
+            <w:tcMar>
+              <w:top w:type="dxa" w:w="70"/>
+              <w:left w:type="dxa" w:w="100"/>
+              <w:bottom w:type="dxa" w:w="70"/>
+              <w:right w:type="dxa" w:w="100"/>
+            </w:tcMar>
+          </w:tcPr>
+          <w:p>
+            <w:pPr>
+              <w:spacing w:after="0"/>
+            </w:pPr>
+            <w:r>
+              <w:rPr>
+                <w:rFonts w:ascii="Courier New" w:cs="Courier New" w:eastAsia="Courier New" w:hAnsi="Courier New"/>
+                <w:color w:val="333333"/>
+                <w:sz w:val="15"/>
+                <w:szCs w:val="15"/>
+              </w:rPr>
+              <w:t xml:space="preserve">emergencia</w:t>
+            </w:r>
+          </w:p>
+        </w:tc>
+        <w:tc>
+          <w:tcPr>
+            <w:tcW w:type="dxa" w:w="4546"/>
+            <w:tcBorders>
+              <w:top w:val="single" w:color="CCCCCC" w:sz="1"/>
+              <w:left w:val="single" w:color="CCCCCC" w:sz="1"/>
+              <w:bottom w:val="single" w:color="CCCCCC" w:sz="1"/>
+              <w:right w:val="single" w:color="CCCCCC" w:sz="1"/>
+            </w:tcBorders>
+            <w:shd w:fill="FFFFFF" w:val="clear"/>
+            <w:tcMar>
+              <w:top w:type="dxa" w:w="70"/>
+              <w:left w:type="dxa" w:w="100"/>
+              <w:bottom w:type="dxa" w:w="70"/>
+              <w:right w:type="dxa" w:w="100"/>
+            </w:tcMar>
+          </w:tcPr>
+          <w:p>
+            <w:pPr>
+              <w:spacing w:after="0"/>
+            </w:pPr>
+            <w:r>
+              <w:rPr>
+                <w:rFonts w:ascii="Courier New" w:cs="Courier New" w:eastAsia="Courier New" w:hAnsi="Courier New"/>
+                <w:color w:val="333333"/>
+                <w:sz w:val="15"/>
+                <w:szCs w:val="15"/>
+              </w:rPr>
+              <w:t xml:space="preserve">yes</w:t>
+            </w:r>
+            <w:r>
+              <w:rPr>
+                <w:rFonts w:ascii="Arial" w:cs="Arial" w:eastAsia="Arial" w:hAnsi="Arial"/>
+                <w:color w:val="333333"/>
+                <w:sz w:val="17"/>
+                <w:szCs w:val="17"/>
+              </w:rPr>
+              <w:t xml:space="preserve"> = sin calefacción o sin aire </w:t>
+            </w:r>
+            <w:r>
+              <w:rPr>
+                <w:rFonts w:ascii="Arial" w:cs="Arial" w:eastAsia="Arial" w:hAnsi="Arial"/>
+                <w:b/>
+                <w:bCs/>
+                <w:color w:val="333333"/>
+                <w:sz w:val="17"/>
+                <w:szCs w:val="17"/>
+              </w:rPr>
+              <w:t xml:space="preserve">ahora</w:t>
+            </w:r>
+            <w:r>
+              <w:rPr>
+                <w:rFonts w:ascii="Arial" w:cs="Arial" w:eastAsia="Arial" w:hAnsi="Arial"/>
+                <w:color w:val="333333"/>
+                <w:sz w:val="17"/>
+                <w:szCs w:val="17"/>
+              </w:rPr>
+              <w:t xml:space="preserve"> → Regla de urgencia (abajo)</w:t>
+            </w:r>
+          </w:p>
+        </w:tc>
+        <w:tc>
+          <w:tcPr>
+            <w:tcW w:type="dxa" w:w="2506"/>
+            <w:tcBorders>
+              <w:top w:val="single" w:color="CCCCCC" w:sz="1"/>
+              <w:left w:val="single" w:color="CCCCCC" w:sz="1"/>
+              <w:bottom w:val="single" w:color="CCCCCC" w:sz="1"/>
+              <w:right w:val="single" w:color="CCCCCC" w:sz="1"/>
+            </w:tcBorders>
+            <w:shd w:fill="FFFFFF" w:val="clear"/>
+            <w:tcMar>
+              <w:top w:type="dxa" w:w="70"/>
+              <w:left w:type="dxa" w:w="100"/>
+              <w:bottom w:type="dxa" w:w="70"/>
+              <w:right w:type="dxa" w:w="100"/>
+            </w:tcMar>
+          </w:tcPr>
+          <w:p>
+            <w:pPr>
+              <w:spacing w:after="0"/>
+            </w:pPr>
+            <w:r>
+              <w:rPr>
+                <w:rFonts w:ascii="Arial" w:cs="Arial" w:eastAsia="Arial" w:hAnsi="Arial"/>
+                <w:color w:val="333333"/>
+                <w:sz w:val="17"/>
+                <w:szCs w:val="17"/>
+              </w:rPr>
+              <w:t xml:space="preserve">Formulario y página</w:t>
+            </w:r>
+          </w:p>
+        </w:tc>
+      </w:tr>
+      <w:tr>
+        <w:trPr>
+          <w:cantSplit/>
+        </w:trPr>
+        <w:tc>
+          <w:tcPr>
+            <w:tcW w:type="dxa" w:w="2920"/>
+            <w:tcBorders>
+              <w:top w:val="single" w:color="CCCCCC" w:sz="1"/>
+              <w:left w:val="single" w:color="CCCCCC" w:sz="1"/>
+              <w:bottom w:val="single" w:color="CCCCCC" w:sz="1"/>
+              <w:right w:val="single" w:color="CCCCCC" w:sz="1"/>
+            </w:tcBorders>
+            <w:shd w:fill="F7F8FA" w:val="clear"/>
+            <w:tcMar>
+              <w:top w:type="dxa" w:w="70"/>
+              <w:left w:type="dxa" w:w="100"/>
+              <w:bottom w:type="dxa" w:w="70"/>
+              <w:right w:type="dxa" w:w="100"/>
+            </w:tcMar>
+          </w:tcPr>
+          <w:p>
+            <w:pPr>
+              <w:spacing w:after="0"/>
+            </w:pPr>
+            <w:r>
+              <w:rPr>
+                <w:rFonts w:ascii="Courier New" w:cs="Courier New" w:eastAsia="Courier New" w:hAnsi="Courier New"/>
+                <w:color w:val="333333"/>
+                <w:sz w:val="15"/>
+                <w:szCs w:val="15"/>
+              </w:rPr>
+              <w:t xml:space="preserve">pisos_casa</w:t>
+            </w:r>
+          </w:p>
+        </w:tc>
+        <w:tc>
+          <w:tcPr>
+            <w:tcW w:type="dxa" w:w="4546"/>
+            <w:tcBorders>
+              <w:top w:val="single" w:color="CCCCCC" w:sz="1"/>
+              <w:left w:val="single" w:color="CCCCCC" w:sz="1"/>
+              <w:bottom w:val="single" w:color="CCCCCC" w:sz="1"/>
+              <w:right w:val="single" w:color="CCCCCC" w:sz="1"/>
+            </w:tcBorders>
+            <w:shd w:fill="F7F8FA" w:val="clear"/>
+            <w:tcMar>
+              <w:top w:type="dxa" w:w="70"/>
+              <w:left w:type="dxa" w:w="100"/>
+              <w:bottom w:type="dxa" w:w="70"/>
+              <w:right w:type="dxa" w:w="100"/>
+            </w:tcMar>
+          </w:tcPr>
+          <w:p>
+            <w:pPr>
+              <w:spacing w:after="0"/>
+            </w:pPr>
+            <w:r>
+              <w:rPr>
+                <w:rFonts w:ascii="Arial" w:cs="Arial" w:eastAsia="Arial" w:hAnsi="Arial"/>
+                <w:color w:val="333333"/>
+                <w:sz w:val="17"/>
+                <w:szCs w:val="17"/>
+              </w:rPr>
+              <w:t xml:space="preserve">Pisos de la casa (1, 2, 3+)</w:t>
+            </w:r>
+          </w:p>
+        </w:tc>
+        <w:tc>
+          <w:tcPr>
+            <w:tcW w:type="dxa" w:w="2506"/>
+            <w:tcBorders>
+              <w:top w:val="single" w:color="CCCCCC" w:sz="1"/>
+              <w:left w:val="single" w:color="CCCCCC" w:sz="1"/>
+              <w:bottom w:val="single" w:color="CCCCCC" w:sz="1"/>
+              <w:right w:val="single" w:color="CCCCCC" w:sz="1"/>
+            </w:tcBorders>
+            <w:shd w:fill="F7F8FA" w:val="clear"/>
+            <w:tcMar>
+              <w:top w:type="dxa" w:w="70"/>
+              <w:left w:type="dxa" w:w="100"/>
+              <w:bottom w:type="dxa" w:w="70"/>
+              <w:right w:type="dxa" w:w="100"/>
+            </w:tcMar>
+          </w:tcPr>
+          <w:p>
+            <w:pPr>
+              <w:spacing w:after="0"/>
+            </w:pPr>
+            <w:r>
+              <w:rPr>
+                <w:rFonts w:ascii="Arial" w:cs="Arial" w:eastAsia="Arial" w:hAnsi="Arial"/>
+                <w:color w:val="333333"/>
+                <w:sz w:val="17"/>
+                <w:szCs w:val="17"/>
+              </w:rPr>
+              <w:t xml:space="preserve">Formulario</w:t>
+            </w:r>
+          </w:p>
+        </w:tc>
+      </w:tr>
+      <w:tr>
+        <w:trPr>
+          <w:cantSplit/>
+        </w:trPr>
+        <w:tc>
+          <w:tcPr>
+            <w:tcW w:type="dxa" w:w="2920"/>
+            <w:tcBorders>
+              <w:top w:val="single" w:color="CCCCCC" w:sz="1"/>
+              <w:left w:val="single" w:color="CCCCCC" w:sz="1"/>
+              <w:bottom w:val="single" w:color="CCCCCC" w:sz="1"/>
+              <w:right w:val="single" w:color="CCCCCC" w:sz="1"/>
+            </w:tcBorders>
+            <w:shd w:fill="FFFFFF" w:val="clear"/>
+            <w:tcMar>
+              <w:top w:type="dxa" w:w="70"/>
+              <w:left w:type="dxa" w:w="100"/>
+              <w:bottom w:type="dxa" w:w="70"/>
+              <w:right w:type="dxa" w:w="100"/>
+            </w:tcMar>
+          </w:tcPr>
+          <w:p>
+            <w:pPr>
+              <w:spacing w:after="0"/>
+            </w:pPr>
+            <w:r>
+              <w:rPr>
+                <w:rFonts w:ascii="Courier New" w:cs="Courier New" w:eastAsia="Courier New" w:hAnsi="Courier New"/>
+                <w:color w:val="333333"/>
+                <w:sz w:val="15"/>
+                <w:szCs w:val="15"/>
+              </w:rPr>
+              <w:t xml:space="preserve">basement</w:t>
+            </w:r>
+          </w:p>
+        </w:tc>
+        <w:tc>
+          <w:tcPr>
+            <w:tcW w:type="dxa" w:w="4546"/>
+            <w:tcBorders>
+              <w:top w:val="single" w:color="CCCCCC" w:sz="1"/>
+              <w:left w:val="single" w:color="CCCCCC" w:sz="1"/>
+              <w:bottom w:val="single" w:color="CCCCCC" w:sz="1"/>
+              <w:right w:val="single" w:color="CCCCCC" w:sz="1"/>
+            </w:tcBorders>
+            <w:shd w:fill="FFFFFF" w:val="clear"/>
+            <w:tcMar>
+              <w:top w:type="dxa" w:w="70"/>
+              <w:left w:type="dxa" w:w="100"/>
+              <w:bottom w:type="dxa" w:w="70"/>
+              <w:right w:type="dxa" w:w="100"/>
+            </w:tcMar>
+          </w:tcPr>
+          <w:p>
+            <w:pPr>
+              <w:spacing w:after="0"/>
+            </w:pPr>
+            <w:r>
+              <w:rPr>
+                <w:rFonts w:ascii="Arial" w:cs="Arial" w:eastAsia="Arial" w:hAnsi="Arial"/>
+                <w:color w:val="333333"/>
+                <w:sz w:val="17"/>
+                <w:szCs w:val="17"/>
+              </w:rPr>
+              <w:t xml:space="preserve">Si tiene basement y si está terminado (habitable)</w:t>
+            </w:r>
+          </w:p>
+        </w:tc>
+        <w:tc>
+          <w:tcPr>
+            <w:tcW w:type="dxa" w:w="2506"/>
+            <w:tcBorders>
+              <w:top w:val="single" w:color="CCCCCC" w:sz="1"/>
+              <w:left w:val="single" w:color="CCCCCC" w:sz="1"/>
+              <w:bottom w:val="single" w:color="CCCCCC" w:sz="1"/>
+              <w:right w:val="single" w:color="CCCCCC" w:sz="1"/>
+            </w:tcBorders>
+            <w:shd w:fill="FFFFFF" w:val="clear"/>
+            <w:tcMar>
+              <w:top w:type="dxa" w:w="70"/>
+              <w:left w:type="dxa" w:w="100"/>
+              <w:bottom w:type="dxa" w:w="70"/>
+              <w:right w:type="dxa" w:w="100"/>
+            </w:tcMar>
+          </w:tcPr>
+          <w:p>
+            <w:pPr>
+              <w:spacing w:after="0"/>
+            </w:pPr>
+            <w:r>
+              <w:rPr>
+                <w:rFonts w:ascii="Arial" w:cs="Arial" w:eastAsia="Arial" w:hAnsi="Arial"/>
+                <w:color w:val="333333"/>
+                <w:sz w:val="17"/>
+                <w:szCs w:val="17"/>
+              </w:rPr>
+              <w:t xml:space="preserve">Formulario</w:t>
+            </w:r>
+          </w:p>
+        </w:tc>
+      </w:tr>
+      <w:tr>
+        <w:trPr>
+          <w:cantSplit/>
+        </w:trPr>
+        <w:tc>
+          <w:tcPr>
+            <w:tcW w:type="dxa" w:w="2920"/>
+            <w:tcBorders>
+              <w:top w:val="single" w:color="CCCCCC" w:sz="1"/>
+              <w:left w:val="single" w:color="CCCCCC" w:sz="1"/>
+              <w:bottom w:val="single" w:color="CCCCCC" w:sz="1"/>
+              <w:right w:val="single" w:color="CCCCCC" w:sz="1"/>
+            </w:tcBorders>
+            <w:shd w:fill="F7F8FA" w:val="clear"/>
+            <w:tcMar>
+              <w:top w:type="dxa" w:w="70"/>
+              <w:left w:type="dxa" w:w="100"/>
+              <w:bottom w:type="dxa" w:w="70"/>
+              <w:right w:type="dxa" w:w="100"/>
+            </w:tcMar>
+          </w:tcPr>
+          <w:p>
+            <w:pPr>
+              <w:spacing w:after="0"/>
+            </w:pPr>
+            <w:r>
+              <w:rPr>
+                <w:rFonts w:ascii="Courier New" w:cs="Courier New" w:eastAsia="Courier New" w:hAnsi="Courier New"/>
+                <w:color w:val="333333"/>
+                <w:sz w:val="15"/>
+                <w:szCs w:val="15"/>
+              </w:rPr>
+              <w:t xml:space="preserve">chimenea</w:t>
+            </w:r>
+          </w:p>
+        </w:tc>
+        <w:tc>
+          <w:tcPr>
+            <w:tcW w:type="dxa" w:w="4546"/>
+            <w:tcBorders>
+              <w:top w:val="single" w:color="CCCCCC" w:sz="1"/>
+              <w:left w:val="single" w:color="CCCCCC" w:sz="1"/>
+              <w:bottom w:val="single" w:color="CCCCCC" w:sz="1"/>
+              <w:right w:val="single" w:color="CCCCCC" w:sz="1"/>
+            </w:tcBorders>
+            <w:shd w:fill="F7F8FA" w:val="clear"/>
+            <w:tcMar>
+              <w:top w:type="dxa" w:w="70"/>
+              <w:left w:type="dxa" w:w="100"/>
+              <w:bottom w:type="dxa" w:w="70"/>
+              <w:right w:type="dxa" w:w="100"/>
+            </w:tcMar>
+          </w:tcPr>
+          <w:p>
+            <w:pPr>
+              <w:spacing w:after="0"/>
+            </w:pPr>
+            <w:r>
+              <w:rPr>
+                <w:rFonts w:ascii="Arial" w:cs="Arial" w:eastAsia="Arial" w:hAnsi="Arial"/>
+                <w:color w:val="333333"/>
+                <w:sz w:val="17"/>
+                <w:szCs w:val="17"/>
+              </w:rPr>
+              <w:t xml:space="preserve">Si tiene chimenea (Yes / No / Not sure)</w:t>
+            </w:r>
+          </w:p>
+        </w:tc>
+        <w:tc>
+          <w:tcPr>
+            <w:tcW w:type="dxa" w:w="2506"/>
+            <w:tcBorders>
+              <w:top w:val="single" w:color="CCCCCC" w:sz="1"/>
+              <w:left w:val="single" w:color="CCCCCC" w:sz="1"/>
+              <w:bottom w:val="single" w:color="CCCCCC" w:sz="1"/>
+              <w:right w:val="single" w:color="CCCCCC" w:sz="1"/>
+            </w:tcBorders>
+            <w:shd w:fill="F7F8FA" w:val="clear"/>
+            <w:tcMar>
+              <w:top w:type="dxa" w:w="70"/>
+              <w:left w:type="dxa" w:w="100"/>
+              <w:bottom w:type="dxa" w:w="70"/>
+              <w:right w:type="dxa" w:w="100"/>
+            </w:tcMar>
+          </w:tcPr>
+          <w:p>
+            <w:pPr>
+              <w:spacing w:after="0"/>
+            </w:pPr>
+            <w:r>
+              <w:rPr>
+                <w:rFonts w:ascii="Arial" w:cs="Arial" w:eastAsia="Arial" w:hAnsi="Arial"/>
+                <w:color w:val="333333"/>
+                <w:sz w:val="17"/>
+                <w:szCs w:val="17"/>
+              </w:rPr>
+              <w:t xml:space="preserve">Formulario</w:t>
+            </w:r>
+          </w:p>
+        </w:tc>
+      </w:tr>
+      <w:tr>
+        <w:trPr>
+          <w:cantSplit/>
+        </w:trPr>
+        <w:tc>
+          <w:tcPr>
+            <w:tcW w:type="dxa" w:w="2920"/>
+            <w:tcBorders>
+              <w:top w:val="single" w:color="CCCCCC" w:sz="1"/>
+              <w:left w:val="single" w:color="CCCCCC" w:sz="1"/>
+              <w:bottom w:val="single" w:color="CCCCCC" w:sz="1"/>
+              <w:right w:val="single" w:color="CCCCCC" w:sz="1"/>
+            </w:tcBorders>
+            <w:shd w:fill="FFFFFF" w:val="clear"/>
+            <w:tcMar>
+              <w:top w:type="dxa" w:w="70"/>
+              <w:left w:type="dxa" w:w="100"/>
+              <w:bottom w:type="dxa" w:w="70"/>
+              <w:right w:type="dxa" w:w="100"/>
+            </w:tcMar>
+          </w:tcPr>
+          <w:p>
+            <w:pPr>
+              <w:spacing w:after="0"/>
+            </w:pPr>
+            <w:r>
+              <w:rPr>
+                <w:rFonts w:ascii="Courier New" w:cs="Courier New" w:eastAsia="Courier New" w:hAnsi="Courier New"/>
+                <w:color w:val="333333"/>
+                <w:sz w:val="15"/>
+                <w:szCs w:val="15"/>
+              </w:rPr>
+              <w:t xml:space="preserve">edad_furnace</w:t>
+            </w:r>
+          </w:p>
+        </w:tc>
+        <w:tc>
+          <w:tcPr>
+            <w:tcW w:type="dxa" w:w="4546"/>
+            <w:tcBorders>
+              <w:top w:val="single" w:color="CCCCCC" w:sz="1"/>
+              <w:left w:val="single" w:color="CCCCCC" w:sz="1"/>
+              <w:bottom w:val="single" w:color="CCCCCC" w:sz="1"/>
+              <w:right w:val="single" w:color="CCCCCC" w:sz="1"/>
+            </w:tcBorders>
+            <w:shd w:fill="FFFFFF" w:val="clear"/>
+            <w:tcMar>
+              <w:top w:type="dxa" w:w="70"/>
+              <w:left w:type="dxa" w:w="100"/>
+              <w:bottom w:type="dxa" w:w="70"/>
+              <w:right w:type="dxa" w:w="100"/>
+            </w:tcMar>
+          </w:tcPr>
+          <w:p>
+            <w:pPr>
+              <w:spacing w:after="0"/>
+            </w:pPr>
+            <w:r>
+              <w:rPr>
+                <w:rFonts w:ascii="Arial" w:cs="Arial" w:eastAsia="Arial" w:hAnsi="Arial"/>
+                <w:color w:val="333333"/>
+                <w:sz w:val="17"/>
+                <w:szCs w:val="17"/>
+              </w:rPr>
+              <w:t xml:space="preserve">Años del furnace actual (si ya lo dijo)</w:t>
+            </w:r>
+          </w:p>
+        </w:tc>
+        <w:tc>
+          <w:tcPr>
+            <w:tcW w:type="dxa" w:w="2506"/>
+            <w:tcBorders>
+              <w:top w:val="single" w:color="CCCCCC" w:sz="1"/>
+              <w:left w:val="single" w:color="CCCCCC" w:sz="1"/>
+              <w:bottom w:val="single" w:color="CCCCCC" w:sz="1"/>
+              <w:right w:val="single" w:color="CCCCCC" w:sz="1"/>
+            </w:tcBorders>
+            <w:shd w:fill="FFFFFF" w:val="clear"/>
+            <w:tcMar>
+              <w:top w:type="dxa" w:w="70"/>
+              <w:left w:type="dxa" w:w="100"/>
+              <w:bottom w:type="dxa" w:w="70"/>
+              <w:right w:type="dxa" w:w="100"/>
+            </w:tcMar>
+          </w:tcPr>
+          <w:p>
+            <w:pPr>
+              <w:spacing w:after="0"/>
+            </w:pPr>
+            <w:r>
+              <w:rPr>
+                <w:rFonts w:ascii="Arial" w:cs="Arial" w:eastAsia="Arial" w:hAnsi="Arial"/>
+                <w:color w:val="333333"/>
+                <w:sz w:val="17"/>
+                <w:szCs w:val="17"/>
+              </w:rPr>
+              <w:t xml:space="preserve">Llamada / página</w:t>
+            </w:r>
+          </w:p>
+        </w:tc>
+      </w:tr>
+      <w:tr>
+        <w:trPr>
+          <w:cantSplit/>
+        </w:trPr>
+        <w:tc>
+          <w:tcPr>
+            <w:tcW w:type="dxa" w:w="2920"/>
+            <w:tcBorders>
+              <w:top w:val="single" w:color="CCCCCC" w:sz="1"/>
+              <w:left w:val="single" w:color="CCCCCC" w:sz="1"/>
+              <w:bottom w:val="single" w:color="CCCCCC" w:sz="1"/>
+              <w:right w:val="single" w:color="CCCCCC" w:sz="1"/>
+            </w:tcBorders>
+            <w:shd w:fill="F7F8FA" w:val="clear"/>
+            <w:tcMar>
+              <w:top w:type="dxa" w:w="70"/>
+              <w:left w:type="dxa" w:w="100"/>
+              <w:bottom w:type="dxa" w:w="70"/>
+              <w:right w:type="dxa" w:w="100"/>
+            </w:tcMar>
+          </w:tcPr>
+          <w:p>
+            <w:pPr>
+              <w:spacing w:after="0"/>
+            </w:pPr>
+            <w:r>
+              <w:rPr>
+                <w:rFonts w:ascii="Courier New" w:cs="Courier New" w:eastAsia="Courier New" w:hAnsi="Courier New"/>
+                <w:color w:val="333333"/>
+                <w:sz w:val="15"/>
+                <w:szCs w:val="15"/>
+              </w:rPr>
+              <w:t xml:space="preserve">proyecto</w:t>
+            </w:r>
+            <w:r>
+              <w:rPr>
+                <w:rFonts w:ascii="Arial" w:cs="Arial" w:eastAsia="Arial" w:hAnsi="Arial"/>
+                <w:color w:val="333333"/>
+                <w:sz w:val="17"/>
+                <w:szCs w:val="17"/>
+              </w:rPr>
+              <w:t xml:space="preserve">, </w:t>
+            </w:r>
+            <w:r>
+              <w:rPr>
+                <w:rFonts w:ascii="Courier New" w:cs="Courier New" w:eastAsia="Courier New" w:hAnsi="Courier New"/>
+                <w:color w:val="333333"/>
+                <w:sz w:val="15"/>
+                <w:szCs w:val="15"/>
+              </w:rPr>
+              <w:t xml:space="preserve">proyecto_detalle</w:t>
+            </w:r>
+            <w:r>
+              <w:rPr>
+                <w:rFonts w:ascii="Arial" w:cs="Arial" w:eastAsia="Arial" w:hAnsi="Arial"/>
+                <w:color w:val="333333"/>
+                <w:sz w:val="17"/>
+                <w:szCs w:val="17"/>
+              </w:rPr>
+              <w:t xml:space="preserve">, </w:t>
+            </w:r>
+            <w:r>
+              <w:rPr>
+                <w:rFonts w:ascii="Courier New" w:cs="Courier New" w:eastAsia="Courier New" w:hAnsi="Courier New"/>
+                <w:color w:val="333333"/>
+                <w:sz w:val="15"/>
+                <w:szCs w:val="15"/>
+              </w:rPr>
+              <w:t xml:space="preserve">plazo</w:t>
+            </w:r>
+          </w:p>
+        </w:tc>
+        <w:tc>
+          <w:tcPr>
+            <w:tcW w:type="dxa" w:w="4546"/>
+            <w:tcBorders>
+              <w:top w:val="single" w:color="CCCCCC" w:sz="1"/>
+              <w:left w:val="single" w:color="CCCCCC" w:sz="1"/>
+              <w:bottom w:val="single" w:color="CCCCCC" w:sz="1"/>
+              <w:right w:val="single" w:color="CCCCCC" w:sz="1"/>
+            </w:tcBorders>
+            <w:shd w:fill="F7F8FA" w:val="clear"/>
+            <w:tcMar>
+              <w:top w:type="dxa" w:w="70"/>
+              <w:left w:type="dxa" w:w="100"/>
+              <w:bottom w:type="dxa" w:w="70"/>
+              <w:right w:type="dxa" w:w="100"/>
+            </w:tcMar>
+          </w:tcPr>
+          <w:p>
+            <w:pPr>
+              <w:spacing w:after="0"/>
+            </w:pPr>
+            <w:r>
+              <w:rPr>
+                <w:rFonts w:ascii="Arial" w:cs="Arial" w:eastAsia="Arial" w:hAnsi="Arial"/>
+                <w:color w:val="333333"/>
+                <w:sz w:val="17"/>
+                <w:szCs w:val="17"/>
+              </w:rPr>
+              <w:t xml:space="preserve">Qué quiere hacer, el detalle y para cuándo</w:t>
+            </w:r>
+          </w:p>
+        </w:tc>
+        <w:tc>
+          <w:tcPr>
+            <w:tcW w:type="dxa" w:w="2506"/>
+            <w:tcBorders>
+              <w:top w:val="single" w:color="CCCCCC" w:sz="1"/>
+              <w:left w:val="single" w:color="CCCCCC" w:sz="1"/>
+              <w:bottom w:val="single" w:color="CCCCCC" w:sz="1"/>
+              <w:right w:val="single" w:color="CCCCCC" w:sz="1"/>
+            </w:tcBorders>
+            <w:shd w:fill="F7F8FA" w:val="clear"/>
+            <w:tcMar>
+              <w:top w:type="dxa" w:w="70"/>
+              <w:left w:type="dxa" w:w="100"/>
+              <w:bottom w:type="dxa" w:w="70"/>
+              <w:right w:type="dxa" w:w="100"/>
+            </w:tcMar>
+          </w:tcPr>
+          <w:p>
+            <w:pPr>
+              <w:spacing w:after="0"/>
+            </w:pPr>
+            <w:r>
+              <w:rPr>
+                <w:rFonts w:ascii="Arial" w:cs="Arial" w:eastAsia="Arial" w:hAnsi="Arial"/>
+                <w:color w:val="333333"/>
+                <w:sz w:val="17"/>
+                <w:szCs w:val="17"/>
+              </w:rPr>
+              <w:t xml:space="preserve">Página</w:t>
+            </w:r>
+          </w:p>
+        </w:tc>
+      </w:tr>
+      <w:tr>
+        <w:trPr>
+          <w:cantSplit/>
+        </w:trPr>
+        <w:tc>
+          <w:tcPr>
+            <w:tcW w:type="dxa" w:w="2920"/>
+            <w:tcBorders>
+              <w:top w:val="single" w:color="CCCCCC" w:sz="1"/>
+              <w:left w:val="single" w:color="CCCCCC" w:sz="1"/>
+              <w:bottom w:val="single" w:color="CCCCCC" w:sz="1"/>
+              <w:right w:val="single" w:color="CCCCCC" w:sz="1"/>
+            </w:tcBorders>
+            <w:shd w:fill="FFFFFF" w:val="clear"/>
+            <w:tcMar>
+              <w:top w:type="dxa" w:w="70"/>
+              <w:left w:type="dxa" w:w="100"/>
+              <w:bottom w:type="dxa" w:w="70"/>
+              <w:right w:type="dxa" w:w="100"/>
+            </w:tcMar>
+          </w:tcPr>
+          <w:p>
+            <w:pPr>
+              <w:spacing w:after="0"/>
+            </w:pPr>
+            <w:r>
+              <w:rPr>
+                <w:rFonts w:ascii="Courier New" w:cs="Courier New" w:eastAsia="Courier New" w:hAnsi="Courier New"/>
+                <w:color w:val="333333"/>
+                <w:sz w:val="15"/>
+                <w:szCs w:val="15"/>
+              </w:rPr>
+              <w:t xml:space="preserve">mensaje_lead</w:t>
+            </w:r>
+          </w:p>
+        </w:tc>
+        <w:tc>
+          <w:tcPr>
+            <w:tcW w:type="dxa" w:w="4546"/>
+            <w:tcBorders>
+              <w:top w:val="single" w:color="CCCCCC" w:sz="1"/>
+              <w:left w:val="single" w:color="CCCCCC" w:sz="1"/>
+              <w:bottom w:val="single" w:color="CCCCCC" w:sz="1"/>
+              <w:right w:val="single" w:color="CCCCCC" w:sz="1"/>
+            </w:tcBorders>
+            <w:shd w:fill="FFFFFF" w:val="clear"/>
+            <w:tcMar>
+              <w:top w:type="dxa" w:w="70"/>
+              <w:left w:type="dxa" w:w="100"/>
+              <w:bottom w:type="dxa" w:w="70"/>
+              <w:right w:type="dxa" w:w="100"/>
+            </w:tcMar>
+          </w:tcPr>
+          <w:p>
+            <w:pPr>
+              <w:spacing w:after="0"/>
+            </w:pPr>
+            <w:r>
+              <w:rPr>
+                <w:rFonts w:ascii="Arial" w:cs="Arial" w:eastAsia="Arial" w:hAnsi="Arial"/>
+                <w:color w:val="333333"/>
+                <w:sz w:val="17"/>
+                <w:szCs w:val="17"/>
+              </w:rPr>
+              <w:t xml:space="preserve">El mensaje que escribió</w:t>
+            </w:r>
+          </w:p>
+        </w:tc>
+        <w:tc>
+          <w:tcPr>
+            <w:tcW w:type="dxa" w:w="2506"/>
+            <w:tcBorders>
+              <w:top w:val="single" w:color="CCCCCC" w:sz="1"/>
+              <w:left w:val="single" w:color="CCCCCC" w:sz="1"/>
+              <w:bottom w:val="single" w:color="CCCCCC" w:sz="1"/>
+              <w:right w:val="single" w:color="CCCCCC" w:sz="1"/>
+            </w:tcBorders>
+            <w:shd w:fill="FFFFFF" w:val="clear"/>
+            <w:tcMar>
+              <w:top w:type="dxa" w:w="70"/>
+              <w:left w:type="dxa" w:w="100"/>
+              <w:bottom w:type="dxa" w:w="70"/>
+              <w:right w:type="dxa" w:w="100"/>
+            </w:tcMar>
+          </w:tcPr>
+          <w:p>
+            <w:pPr>
+              <w:spacing w:after="0"/>
+            </w:pPr>
+            <w:r>
+              <w:rPr>
+                <w:rFonts w:ascii="Arial" w:cs="Arial" w:eastAsia="Arial" w:hAnsi="Arial"/>
+                <w:color w:val="333333"/>
+                <w:sz w:val="17"/>
+                <w:szCs w:val="17"/>
+              </w:rPr>
+              <w:t xml:space="preserve">Página</w:t>
+            </w:r>
+          </w:p>
+        </w:tc>
+      </w:tr>
+      <w:tr>
+        <w:trPr>
+          <w:cantSplit/>
+        </w:trPr>
+        <w:tc>
+          <w:tcPr>
+            <w:tcW w:type="dxa" w:w="2920"/>
+            <w:tcBorders>
+              <w:top w:val="single" w:color="CCCCCC" w:sz="1"/>
+              <w:left w:val="single" w:color="CCCCCC" w:sz="1"/>
+              <w:bottom w:val="single" w:color="CCCCCC" w:sz="1"/>
+              <w:right w:val="single" w:color="CCCCCC" w:sz="1"/>
+            </w:tcBorders>
+            <w:shd w:fill="F7F8FA" w:val="clear"/>
+            <w:tcMar>
+              <w:top w:type="dxa" w:w="70"/>
+              <w:left w:type="dxa" w:w="100"/>
+              <w:bottom w:type="dxa" w:w="70"/>
+              <w:right w:type="dxa" w:w="100"/>
+            </w:tcMar>
+          </w:tcPr>
+          <w:p>
+            <w:pPr>
+              <w:spacing w:after="0"/>
+            </w:pPr>
+            <w:r>
+              <w:rPr>
+                <w:rFonts w:ascii="Arial" w:cs="Arial" w:eastAsia="Arial" w:hAnsi="Arial"/>
+                <w:color w:val="333333"/>
+                <w:sz w:val="17"/>
+                <w:szCs w:val="17"/>
+              </w:rPr>
+              <w:t xml:space="preserve">Contact source = *Facebook*</w:t>
+            </w:r>
+          </w:p>
+        </w:tc>
+        <w:tc>
+          <w:tcPr>
+            <w:tcW w:type="dxa" w:w="4546"/>
+            <w:tcBorders>
+              <w:top w:val="single" w:color="CCCCCC" w:sz="1"/>
+              <w:left w:val="single" w:color="CCCCCC" w:sz="1"/>
+              <w:bottom w:val="single" w:color="CCCCCC" w:sz="1"/>
+              <w:right w:val="single" w:color="CCCCCC" w:sz="1"/>
+            </w:tcBorders>
+            <w:shd w:fill="F7F8FA" w:val="clear"/>
+            <w:tcMar>
+              <w:top w:type="dxa" w:w="70"/>
+              <w:left w:type="dxa" w:w="100"/>
+              <w:bottom w:type="dxa" w:w="70"/>
+              <w:right w:type="dxa" w:w="100"/>
+            </w:tcMar>
+          </w:tcPr>
+          <w:p>
+            <w:pPr>
+              <w:spacing w:after="0"/>
+            </w:pPr>
+            <w:r>
+              <w:rPr>
+                <w:rFonts w:ascii="Arial" w:cs="Arial" w:eastAsia="Arial" w:hAnsi="Arial"/>
+                <w:color w:val="333333"/>
+                <w:sz w:val="17"/>
+                <w:szCs w:val="17"/>
+              </w:rPr>
+              <w:t xml:space="preserve">Llegó por el formulario de Meta</w:t>
+            </w:r>
+          </w:p>
+        </w:tc>
+        <w:tc>
+          <w:tcPr>
+            <w:tcW w:type="dxa" w:w="2506"/>
+            <w:tcBorders>
+              <w:top w:val="single" w:color="CCCCCC" w:sz="1"/>
+              <w:left w:val="single" w:color="CCCCCC" w:sz="1"/>
+              <w:bottom w:val="single" w:color="CCCCCC" w:sz="1"/>
+              <w:right w:val="single" w:color="CCCCCC" w:sz="1"/>
+            </w:tcBorders>
+            <w:shd w:fill="F7F8FA" w:val="clear"/>
+            <w:tcMar>
+              <w:top w:type="dxa" w:w="70"/>
+              <w:left w:type="dxa" w:w="100"/>
+              <w:bottom w:type="dxa" w:w="70"/>
+              <w:right w:type="dxa" w:w="100"/>
+            </w:tcMar>
+          </w:tcPr>
+          <w:p>
+            <w:pPr>
+              <w:spacing w:after="0"/>
+            </w:pPr>
+            <w:r>
+              <w:rPr>
+                <w:rFonts w:ascii="Arial" w:cs="Arial" w:eastAsia="Arial" w:hAnsi="Arial"/>
+                <w:color w:val="333333"/>
+                <w:sz w:val="17"/>
+                <w:szCs w:val="17"/>
+              </w:rPr>
+              <w:t xml:space="preserve">Formulario</w:t>
+            </w:r>
+          </w:p>
+        </w:tc>
+      </w:tr>
+    </w:tbl>
+    <w:p>
+      <w:pPr>
+        <w:spacing w:after="160"/>
+      </w:pPr>
+      <w:r>
+        <w:t xml:space="preserve"/>
+      </w:r>
+    </w:p>
+    <w:p>
+      <w:pPr>
+        <w:spacing w:after="110"/>
+      </w:pPr>
+      <w:r>
+        <w:rPr>
+          <w:rFonts w:ascii="Arial" w:cs="Arial" w:eastAsia="Arial" w:hAnsi="Arial"/>
+          <w:b/>
+          <w:bCs/>
+          <w:color w:val="333333"/>
+          <w:sz w:val="20"/>
+          <w:szCs w:val="20"/>
+        </w:rPr>
+        <w:t xml:space="preserve">Lead del formulario de Meta (etiqueta </w:t>
+      </w:r>
+      <w:r>
+        <w:rPr>
+          <w:rFonts w:ascii="Courier New" w:cs="Courier New" w:eastAsia="Courier New" w:hAnsi="Courier New"/>
+          <w:color w:val="333333"/>
+          <w:sz w:val="18"/>
+          <w:szCs w:val="18"/>
+        </w:rPr>
+        <w:t xml:space="preserve">origen-formulario-meta</w:t>
+      </w:r>
+      <w:r>
+        <w:rPr>
+          <w:rFonts w:ascii="Arial" w:cs="Arial" w:eastAsia="Arial" w:hAnsi="Arial"/>
+          <w:b/>
+          <w:bCs/>
+          <w:color w:val="333333"/>
+          <w:sz w:val="20"/>
+          <w:szCs w:val="20"/>
+        </w:rPr>
+        <w:t xml:space="preserve">):</w:t>
+      </w:r>
+      <w:r>
+        <w:rPr>
+          <w:rFonts w:ascii="Arial" w:cs="Arial" w:eastAsia="Arial" w:hAnsi="Arial"/>
+          <w:color w:val="333333"/>
+          <w:sz w:val="20"/>
+          <w:szCs w:val="20"/>
+        </w:rPr>
+        <w:t xml:space="preserve"> ya trae 3 de los 4 datos del reemplazo (pisos, basement y chimenea). Si </w:t>
+      </w:r>
+      <w:r>
+        <w:rPr>
+          <w:rFonts w:ascii="Courier New" w:cs="Courier New" w:eastAsia="Courier New" w:hAnsi="Courier New"/>
+          <w:color w:val="333333"/>
+          <w:sz w:val="18"/>
+          <w:szCs w:val="18"/>
+        </w:rPr>
+        <w:t xml:space="preserve">servicio</w:t>
+      </w:r>
+      <w:r>
+        <w:rPr>
+          <w:rFonts w:ascii="Arial" w:cs="Arial" w:eastAsia="Arial" w:hAnsi="Arial"/>
+          <w:color w:val="333333"/>
+          <w:sz w:val="20"/>
+          <w:szCs w:val="20"/>
+        </w:rPr>
+        <w:t xml:space="preserve"> dice *Furnace replacement*, en la llamada </w:t>
+      </w:r>
+      <w:r>
+        <w:rPr>
+          <w:rFonts w:ascii="Arial" w:cs="Arial" w:eastAsia="Arial" w:hAnsi="Arial"/>
+          <w:b/>
+          <w:bCs/>
+          <w:color w:val="333333"/>
+          <w:sz w:val="20"/>
+          <w:szCs w:val="20"/>
+        </w:rPr>
+        <w:t xml:space="preserve">solo confirmas</w:t>
+      </w:r>
+      <w:r>
+        <w:rPr>
+          <w:rFonts w:ascii="Arial" w:cs="Arial" w:eastAsia="Arial" w:hAnsi="Arial"/>
+          <w:color w:val="333333"/>
+          <w:sz w:val="20"/>
+          <w:szCs w:val="20"/>
+        </w:rPr>
+        <w:t xml:space="preserve"> esos 3 y preguntas lo que falta: </w:t>
+      </w:r>
+      <w:r>
+        <w:rPr>
+          <w:rFonts w:ascii="Arial" w:cs="Arial" w:eastAsia="Arial" w:hAnsi="Arial"/>
+          <w:b/>
+          <w:bCs/>
+          <w:color w:val="333333"/>
+          <w:sz w:val="20"/>
+          <w:szCs w:val="20"/>
+        </w:rPr>
+        <w:t xml:space="preserve">si es de gas, cuántos años tiene, si el basement es habitable</w:t>
+      </w:r>
+      <w:r>
+        <w:rPr>
+          <w:rFonts w:ascii="Arial" w:cs="Arial" w:eastAsia="Arial" w:hAnsi="Arial"/>
+          <w:color w:val="333333"/>
+          <w:sz w:val="20"/>
+          <w:szCs w:val="20"/>
+        </w:rPr>
+        <w:t xml:space="preserve"> (si no lo dijo) </w:t>
+      </w:r>
+      <w:r>
+        <w:rPr>
+          <w:rFonts w:ascii="Arial" w:cs="Arial" w:eastAsia="Arial" w:hAnsi="Arial"/>
+          <w:b/>
+          <w:bCs/>
+          <w:color w:val="333333"/>
+          <w:sz w:val="20"/>
+          <w:szCs w:val="20"/>
+        </w:rPr>
+        <w:t xml:space="preserve">y la dirección</w:t>
+      </w:r>
+      <w:r>
+        <w:rPr>
+          <w:rFonts w:ascii="Arial" w:cs="Arial" w:eastAsia="Arial" w:hAnsi="Arial"/>
+          <w:color w:val="333333"/>
+          <w:sz w:val="20"/>
+          <w:szCs w:val="20"/>
+        </w:rPr>
+        <w:t xml:space="preserve">. Si </w:t>
+      </w:r>
+      <w:r>
+        <w:rPr>
+          <w:rFonts w:ascii="Courier New" w:cs="Courier New" w:eastAsia="Courier New" w:hAnsi="Courier New"/>
+          <w:color w:val="333333"/>
+          <w:sz w:val="18"/>
+          <w:szCs w:val="18"/>
+        </w:rPr>
+        <w:t xml:space="preserve">emergencia</w:t>
+      </w:r>
+      <w:r>
+        <w:rPr>
+          <w:rFonts w:ascii="Arial" w:cs="Arial" w:eastAsia="Arial" w:hAnsi="Arial"/>
+          <w:color w:val="333333"/>
+          <w:sz w:val="20"/>
+          <w:szCs w:val="20"/>
+        </w:rPr>
+        <w:t xml:space="preserve"> = </w:t>
+      </w:r>
+      <w:r>
+        <w:rPr>
+          <w:rFonts w:ascii="Courier New" w:cs="Courier New" w:eastAsia="Courier New" w:hAnsi="Courier New"/>
+          <w:color w:val="333333"/>
+          <w:sz w:val="18"/>
+          <w:szCs w:val="18"/>
+        </w:rPr>
+        <w:t xml:space="preserve">yes</w:t>
+      </w:r>
+      <w:r>
+        <w:rPr>
+          <w:rFonts w:ascii="Arial" w:cs="Arial" w:eastAsia="Arial" w:hAnsi="Arial"/>
+          <w:color w:val="333333"/>
+          <w:sz w:val="20"/>
+          <w:szCs w:val="20"/>
+        </w:rPr>
+        <w:t xml:space="preserve">, se llama de inmediato (Regla de urgencia).</w:t>
+      </w:r>
+    </w:p>
+    <w:p>
+      <w:pPr>
+        <w:keepLines/>
+        <w:shd w:fill="F2F4F7" w:val="clear"/>
+        <w:spacing w:after="0"/>
+        <w:ind w:left="100" w:right="100"/>
+      </w:pPr>
+      <w:r>
+        <w:rPr>
+          <w:rFonts w:ascii="Courier New" w:cs="Courier New" w:eastAsia="Courier New" w:hAnsi="Courier New"/>
+          <w:color w:val="1B2A4A"/>
+          <w:sz w:val="17"/>
+          <w:szCs w:val="17"/>
+        </w:rPr>
+        <w:t xml:space="preserve">"Hi [Name], this is [your name] from Aire Express. You filled out our form about replacing your furnace — I have your answers here:</w:t>
+      </w:r>
+    </w:p>
+    <w:p>
+      <w:pPr>
+        <w:keepLines/>
+        <w:shd w:fill="F2F4F7" w:val="clear"/>
+        <w:spacing w:after="0"/>
+        <w:ind w:left="100" w:right="100"/>
+      </w:pPr>
+      <w:r>
+        <w:rPr>
+          <w:rFonts w:ascii="Courier New" w:cs="Courier New" w:eastAsia="Courier New" w:hAnsi="Courier New"/>
+          <w:color w:val="1B2A4A"/>
+          <w:sz w:val="17"/>
+          <w:szCs w:val="17"/>
+        </w:rPr>
+        <w:t xml:space="preserve">a [2]-story home, [with an unfinished basement], and [a chimney]. Is that right?"</w:t>
+      </w:r>
+    </w:p>
+    <w:p>
+      <w:pPr>
+        <w:keepLines/>
+        <w:shd w:fill="F2F4F7" w:val="clear"/>
+        <w:spacing w:after="0"/>
+        <w:ind w:left="100" w:right="100"/>
+      </w:pPr>
+      <w:r>
+        <w:rPr>
+          <w:rFonts w:ascii="Courier New" w:cs="Courier New" w:eastAsia="Courier New" w:hAnsi="Courier New"/>
+          <w:color w:val="1B2A4A"/>
+          <w:sz w:val="17"/>
+          <w:szCs w:val="17"/>
+        </w:rPr>
+        <w:t xml:space="preserve">(Hola [nombre], soy [tu nombre] de Aire Express. Llenaste nuestro formulario para cambiar tu furnace y tengo tus respuestas: casa de</w:t>
+      </w:r>
+    </w:p>
+    <w:p>
+      <w:pPr>
+        <w:keepLines/>
+        <w:shd w:fill="F2F4F7" w:val="clear"/>
+        <w:spacing w:after="0"/>
+        <w:ind w:left="100" w:right="100"/>
+      </w:pPr>
+      <w:r>
+        <w:rPr>
+          <w:rFonts w:ascii="Courier New" w:cs="Courier New" w:eastAsia="Courier New" w:hAnsi="Courier New"/>
+          <w:color w:val="1B2A4A"/>
+          <w:sz w:val="17"/>
+          <w:szCs w:val="17"/>
+        </w:rPr>
+        <w:t xml:space="preserve">[2] pisos, [con basement sin terminar] y [con chimenea]. ¿Es correcto?)</w:t>
+      </w:r>
+    </w:p>
+    <w:p>
+      <w:pPr>
+        <w:keepLines/>
+        <w:shd w:fill="F2F4F7" w:val="clear"/>
+        <w:spacing w:after="0"/>
+        <w:ind w:left="100" w:right="100"/>
+      </w:pPr>
+      <w:r>
+        <w:rPr>
+          <w:rFonts w:ascii="Courier New" w:cs="Courier New" w:eastAsia="Courier New" w:hAnsi="Courier New"/>
+          <w:color w:val="1B2A4A"/>
+          <w:sz w:val="17"/>
+          <w:szCs w:val="17"/>
+        </w:rPr>
+        <w:t xml:space="preserve"> </w:t>
+      </w:r>
+    </w:p>
+    <w:p>
+      <w:pPr>
+        <w:keepLines/>
+        <w:shd w:fill="F2F4F7" w:val="clear"/>
+        <w:spacing w:after="0"/>
+        <w:ind w:left="100" w:right="100"/>
+      </w:pPr>
+      <w:r>
+        <w:rPr>
+          <w:rFonts w:ascii="Courier New" w:cs="Courier New" w:eastAsia="Courier New" w:hAnsi="Courier New"/>
+          <w:color w:val="1B2A4A"/>
+          <w:sz w:val="17"/>
+          <w:szCs w:val="17"/>
+        </w:rPr>
+        <w:t xml:space="preserve">"You also told us your heat is out right now — is anyone at home without heat? We'll move fast on this."   ← solo si emergencia = yes</w:t>
+      </w:r>
+    </w:p>
+    <w:p>
+      <w:pPr>
+        <w:keepLines/>
+        <w:shd w:fill="F2F4F7" w:val="clear"/>
+        <w:spacing w:after="0"/>
+        <w:ind w:left="100" w:right="100"/>
+      </w:pPr>
+      <w:r>
+        <w:rPr>
+          <w:rFonts w:ascii="Courier New" w:cs="Courier New" w:eastAsia="Courier New" w:hAnsi="Courier New"/>
+          <w:color w:val="1B2A4A"/>
+          <w:sz w:val="17"/>
+          <w:szCs w:val="17"/>
+        </w:rPr>
+        <w:t xml:space="preserve">(También nos dijiste que te quedaste sin calefacción. ¿Hay alguien en la casa sin calefacción? Vamos a moverlo rápido.)</w:t>
+      </w:r>
+    </w:p>
+    <w:p>
+      <w:pPr>
+        <w:keepLines/>
+        <w:shd w:fill="F2F4F7" w:val="clear"/>
+        <w:spacing w:after="0"/>
+        <w:ind w:left="100" w:right="100"/>
+      </w:pPr>
+      <w:r>
+        <w:rPr>
+          <w:rFonts w:ascii="Courier New" w:cs="Courier New" w:eastAsia="Courier New" w:hAnsi="Courier New"/>
+          <w:color w:val="1B2A4A"/>
+          <w:sz w:val="17"/>
+          <w:szCs w:val="17"/>
+        </w:rPr>
+        <w:t xml:space="preserve"> </w:t>
+      </w:r>
+    </w:p>
+    <w:p>
+      <w:pPr>
+        <w:keepLines/>
+        <w:shd w:fill="F2F4F7" w:val="clear"/>
+        <w:spacing w:after="0"/>
+        <w:ind w:left="100" w:right="100"/>
+      </w:pPr>
+      <w:r>
+        <w:rPr>
+          <w:rFonts w:ascii="Courier New" w:cs="Courier New" w:eastAsia="Courier New" w:hAnsi="Courier New"/>
+          <w:color w:val="1B2A4A"/>
+          <w:sz w:val="17"/>
+          <w:szCs w:val="17"/>
+        </w:rPr>
+        <w:t xml:space="preserve">"Just two more things so Juan David can give you your exact price: is it a gas furnace, and about how old is the one you have now?"</w:t>
+      </w:r>
+    </w:p>
+    <w:p>
+      <w:pPr>
+        <w:keepLines/>
+        <w:shd w:fill="F2F4F7" w:val="clear"/>
+        <w:spacing w:after="0"/>
+        <w:ind w:left="100" w:right="100"/>
+      </w:pPr>
+      <w:r>
+        <w:rPr>
+          <w:rFonts w:ascii="Courier New" w:cs="Courier New" w:eastAsia="Courier New" w:hAnsi="Courier New"/>
+          <w:color w:val="1B2A4A"/>
+          <w:sz w:val="17"/>
+          <w:szCs w:val="17"/>
+        </w:rPr>
+        <w:t xml:space="preserve">(Solo dos cosas más para que Juan David te dé el precio exacto: ¿es de gas y cuántos años tiene el que tienes ahora?)</w:t>
+      </w:r>
+    </w:p>
+    <w:p>
+      <w:pPr>
+        <w:keepLines/>
+        <w:shd w:fill="F2F4F7" w:val="clear"/>
+        <w:spacing w:after="0"/>
+        <w:ind w:left="100" w:right="100"/>
+      </w:pPr>
+      <w:r>
+        <w:rPr>
+          <w:rFonts w:ascii="Courier New" w:cs="Courier New" w:eastAsia="Courier New" w:hAnsi="Courier New"/>
+          <w:color w:val="1B2A4A"/>
+          <w:sz w:val="17"/>
+          <w:szCs w:val="17"/>
+        </w:rPr>
+        <w:t xml:space="preserve"> </w:t>
+      </w:r>
+    </w:p>
+    <w:p>
+      <w:pPr>
+        <w:keepLines/>
+        <w:shd w:fill="F2F4F7" w:val="clear"/>
+        <w:spacing w:after="0"/>
+        <w:ind w:left="100" w:right="100"/>
+      </w:pPr>
+      <w:r>
+        <w:rPr>
+          <w:rFonts w:ascii="Courier New" w:cs="Courier New" w:eastAsia="Courier New" w:hAnsi="Courier New"/>
+          <w:color w:val="1B2A4A"/>
+          <w:sz w:val="17"/>
+          <w:szCs w:val="17"/>
+        </w:rPr>
+        <w:t xml:space="preserve">"And what's the address where the furnace is?"   (¿Y cuál es la dirección donde está el furnace?)</w:t>
+      </w:r>
+    </w:p>
+    <w:p>
+      <w:pPr>
+        <w:spacing w:after="160"/>
+      </w:pPr>
+      <w:r>
+        <w:t xml:space="preserve"/>
+      </w:r>
+    </w:p>
+    <w:p>
+      <w:pPr>
+        <w:spacing w:after="110"/>
+      </w:pPr>
+      <w:r>
+        <w:rPr>
+          <w:rFonts w:ascii="Arial" w:cs="Arial" w:eastAsia="Arial" w:hAnsi="Arial"/>
+          <w:color w:val="333333"/>
+          <w:sz w:val="20"/>
+          <w:szCs w:val="20"/>
+        </w:rPr>
+        <w:t xml:space="preserve">Si </w:t>
+      </w:r>
+      <w:r>
+        <w:rPr>
+          <w:rFonts w:ascii="Courier New" w:cs="Courier New" w:eastAsia="Courier New" w:hAnsi="Courier New"/>
+          <w:color w:val="333333"/>
+          <w:sz w:val="18"/>
+          <w:szCs w:val="18"/>
+        </w:rPr>
+        <w:t xml:space="preserve">chimenea</w:t>
+      </w:r>
+      <w:r>
+        <w:rPr>
+          <w:rFonts w:ascii="Arial" w:cs="Arial" w:eastAsia="Arial" w:hAnsi="Arial"/>
+          <w:color w:val="333333"/>
+          <w:sz w:val="20"/>
+          <w:szCs w:val="20"/>
+        </w:rPr>
+        <w:t xml:space="preserve"> = *Not sure*: "No worries — is there a chimney or a vent pipe that goes up through the roof?" (¿Hay chimenea o un tubo que sale por el techo?). Después sigue igual que abajo: "Juan David, our installer, will review this and we'll call you back…".</w:t>
+      </w:r>
+    </w:p>
+    <w:p>
+      <w:pPr>
+        <w:spacing w:after="110"/>
+      </w:pPr>
+      <w:r>
+        <w:rPr>
+          <w:rFonts w:ascii="Arial" w:cs="Arial" w:eastAsia="Arial" w:hAnsi="Arial"/>
+          <w:b/>
+          <w:bCs/>
+          <w:color w:val="333333"/>
+          <w:sz w:val="20"/>
+          <w:szCs w:val="20"/>
+        </w:rPr>
+        <w:t xml:space="preserve">Furnace — REEMPLAZO (ya tiene un furnace y lo quiere cambiar) — se cotiza por teléfono (Juan David, 15-oct):</w:t>
+      </w:r>
+      <w:r>
+        <w:rPr>
+          <w:rFonts w:ascii="Arial" w:cs="Arial" w:eastAsia="Arial" w:hAnsi="Arial"/>
+          <w:color w:val="333333"/>
+          <w:sz w:val="20"/>
+          <w:szCs w:val="20"/>
+        </w:rPr>
+        <w:t xml:space="preserve"> Si es </w:t>
+      </w:r>
+      <w:r>
+        <w:rPr>
+          <w:rFonts w:ascii="Arial" w:cs="Arial" w:eastAsia="Arial" w:hAnsi="Arial"/>
+          <w:b/>
+          <w:bCs/>
+          <w:color w:val="333333"/>
+          <w:sz w:val="20"/>
+          <w:szCs w:val="20"/>
+        </w:rPr>
+        <w:t xml:space="preserve">instalación nueva</w:t>
+      </w:r>
+      <w:r>
+        <w:rPr>
+          <w:rFonts w:ascii="Arial" w:cs="Arial" w:eastAsia="Arial" w:hAnsi="Arial"/>
+          <w:color w:val="333333"/>
+          <w:sz w:val="20"/>
+          <w:szCs w:val="20"/>
+        </w:rPr>
+        <w:t xml:space="preserve"> (la casa no tiene furnace), no uses este bloque: ve a "Furnace — INSTALACIÓN NUEVA" más abajo. Si el lead viene del </w:t>
+      </w:r>
+      <w:r>
+        <w:rPr>
+          <w:rFonts w:ascii="Arial" w:cs="Arial" w:eastAsia="Arial" w:hAnsi="Arial"/>
+          <w:b/>
+          <w:bCs/>
+          <w:color w:val="333333"/>
+          <w:sz w:val="20"/>
+          <w:szCs w:val="20"/>
+        </w:rPr>
+        <w:t xml:space="preserve">formulario de Meta</w:t>
+      </w:r>
+      <w:r>
+        <w:rPr>
+          <w:rFonts w:ascii="Arial" w:cs="Arial" w:eastAsia="Arial" w:hAnsi="Arial"/>
+          <w:color w:val="333333"/>
+          <w:sz w:val="20"/>
+          <w:szCs w:val="20"/>
+        </w:rPr>
+        <w:t xml:space="preserve">, usa el bloque de arriba (ya trae pisos, basement y chimenea). Si viene de la página o de una llamada, usa este:</w:t>
       </w:r>
     </w:p>
     <w:p>

</xml_diff>

<commit_message>
Aire Express setter: add AC installation call script (free visit, from $4,000)
Co-Authored-By: Claude Opus 5.5 <noreply@anthropic.com>
</commit_message>
<xml_diff>
--- a/induccion-aire-express/guiones/docs/01_SPEECH_CONTACTABILIDAD.docx
+++ b/induccion-aire-express/guiones/docs/01_SPEECH_CONTACTABILIDAD.docx
@@ -3092,6 +3092,351 @@
       </w:pPr>
       <w:r>
         <w:t xml:space="preserve"/>
+      </w:r>
+    </w:p>
+    <w:p>
+      <w:pPr>
+        <w:spacing w:after="110"/>
+      </w:pPr>
+      <w:r>
+        <w:rPr>
+          <w:rFonts w:ascii="Arial" w:cs="Arial" w:eastAsia="Arial" w:hAnsi="Arial"/>
+          <w:b/>
+          <w:bCs/>
+          <w:color w:val="333333"/>
+          <w:sz w:val="20"/>
+          <w:szCs w:val="20"/>
+        </w:rPr>
+        <w:t xml:space="preserve">Aire acondicionado — INSTALACIÓN O CAMBIO (el precio exacto se da en la visita gratis):</w:t>
+      </w:r>
+      <w:r>
+        <w:rPr>
+          <w:rFonts w:ascii="Arial" w:cs="Arial" w:eastAsia="Arial" w:hAnsi="Arial"/>
+          <w:color w:val="333333"/>
+          <w:sz w:val="20"/>
+          <w:szCs w:val="20"/>
+        </w:rPr>
+        <w:t xml:space="preserve"> El aire </w:t>
+      </w:r>
+      <w:r>
+        <w:rPr>
+          <w:rFonts w:ascii="Arial" w:cs="Arial" w:eastAsia="Arial" w:hAnsi="Arial"/>
+          <w:b/>
+          <w:bCs/>
+          <w:color w:val="333333"/>
+          <w:sz w:val="20"/>
+          <w:szCs w:val="20"/>
+        </w:rPr>
+        <w:t xml:space="preserve">no</w:t>
+      </w:r>
+      <w:r>
+        <w:rPr>
+          <w:rFonts w:ascii="Arial" w:cs="Arial" w:eastAsia="Arial" w:hAnsi="Arial"/>
+          <w:color w:val="333333"/>
+          <w:sz w:val="20"/>
+          <w:szCs w:val="20"/>
+        </w:rPr>
+        <w:t xml:space="preserve"> se cotiza por teléfono como el reemplazo de furnace: se agenda la visita. Tú solo dices el "desde $4,000". Si el lead pidió reparación del aire (no cambio), usa el bloque </w:t>
+      </w:r>
+      <w:r>
+        <w:rPr>
+          <w:rFonts w:ascii="Arial" w:cs="Arial" w:eastAsia="Arial" w:hAnsi="Arial"/>
+          <w:b/>
+          <w:bCs/>
+          <w:color w:val="333333"/>
+          <w:sz w:val="20"/>
+          <w:szCs w:val="20"/>
+        </w:rPr>
+        <w:t xml:space="preserve">Reparación</w:t>
+      </w:r>
+      <w:r>
+        <w:rPr>
+          <w:rFonts w:ascii="Arial" w:cs="Arial" w:eastAsia="Arial" w:hAnsi="Arial"/>
+          <w:color w:val="333333"/>
+          <w:sz w:val="20"/>
+          <w:szCs w:val="20"/>
+        </w:rPr>
+        <w:t xml:space="preserve"> de abajo.</w:t>
+      </w:r>
+    </w:p>
+    <w:p>
+      <w:pPr>
+        <w:keepLines/>
+        <w:shd w:fill="F2F4F7" w:val="clear"/>
+        <w:spacing w:after="0"/>
+        <w:ind w:left="100" w:right="100"/>
+      </w:pPr>
+      <w:r>
+        <w:rPr>
+          <w:rFonts w:ascii="Courier New" w:cs="Courier New" w:eastAsia="Courier New" w:hAnsi="Courier New"/>
+          <w:color w:val="1B2A4A"/>
+          <w:sz w:val="17"/>
+          <w:szCs w:val="17"/>
+        </w:rPr>
+        <w:t xml:space="preserve">"Hi [Name], this is [your name] from Aire Express. You asked about a new AC for your home in [City]. Is this a good time?"</w:t>
+      </w:r>
+    </w:p>
+    <w:p>
+      <w:pPr>
+        <w:keepLines/>
+        <w:shd w:fill="F2F4F7" w:val="clear"/>
+        <w:spacing w:after="0"/>
+        <w:ind w:left="100" w:right="100"/>
+      </w:pPr>
+      <w:r>
+        <w:rPr>
+          <w:rFonts w:ascii="Courier New" w:cs="Courier New" w:eastAsia="Courier New" w:hAnsi="Courier New"/>
+          <w:color w:val="1B2A4A"/>
+          <w:sz w:val="17"/>
+          <w:szCs w:val="17"/>
+        </w:rPr>
+        <w:t xml:space="preserve">(Hola [nombre], soy [tu nombre] de Aire Express. Pediste un aire acondicionado nuevo para tu casa en [ciudad]. ¿Es buen momento?)</w:t>
+      </w:r>
+    </w:p>
+    <w:p>
+      <w:pPr>
+        <w:keepLines/>
+        <w:shd w:fill="F2F4F7" w:val="clear"/>
+        <w:spacing w:after="0"/>
+        <w:ind w:left="100" w:right="100"/>
+      </w:pPr>
+      <w:r>
+        <w:rPr>
+          <w:rFonts w:ascii="Courier New" w:cs="Courier New" w:eastAsia="Courier New" w:hAnsi="Courier New"/>
+          <w:color w:val="1B2A4A"/>
+          <w:sz w:val="17"/>
+          <w:szCs w:val="17"/>
+        </w:rPr>
+        <w:t xml:space="preserve"> </w:t>
+      </w:r>
+    </w:p>
+    <w:p>
+      <w:pPr>
+        <w:keepLines/>
+        <w:shd w:fill="F2F4F7" w:val="clear"/>
+        <w:spacing w:after="0"/>
+        <w:ind w:left="100" w:right="100"/>
+      </w:pPr>
+      <w:r>
+        <w:rPr>
+          <w:rFonts w:ascii="Courier New" w:cs="Courier New" w:eastAsia="Courier New" w:hAnsi="Courier New"/>
+          <w:color w:val="1B2A4A"/>
+          <w:sz w:val="17"/>
+          <w:szCs w:val="17"/>
+        </w:rPr>
+        <w:t xml:space="preserve">"Is your current system still working, or is it already giving you problems?"</w:t>
+      </w:r>
+    </w:p>
+    <w:p>
+      <w:pPr>
+        <w:keepLines/>
+        <w:shd w:fill="F2F4F7" w:val="clear"/>
+        <w:spacing w:after="0"/>
+        <w:ind w:left="100" w:right="100"/>
+      </w:pPr>
+      <w:r>
+        <w:rPr>
+          <w:rFonts w:ascii="Courier New" w:cs="Courier New" w:eastAsia="Courier New" w:hAnsi="Courier New"/>
+          <w:color w:val="1B2A4A"/>
+          <w:sz w:val="17"/>
+          <w:szCs w:val="17"/>
+        </w:rPr>
+        <w:t xml:space="preserve">(¿Tu sistema actual todavía funciona o ya está fallando?)</w:t>
+      </w:r>
+    </w:p>
+    <w:p>
+      <w:pPr>
+        <w:keepLines/>
+        <w:shd w:fill="F2F4F7" w:val="clear"/>
+        <w:spacing w:after="0"/>
+        <w:ind w:left="100" w:right="100"/>
+      </w:pPr>
+      <w:r>
+        <w:rPr>
+          <w:rFonts w:ascii="Courier New" w:cs="Courier New" w:eastAsia="Courier New" w:hAnsi="Courier New"/>
+          <w:color w:val="1B2A4A"/>
+          <w:sz w:val="17"/>
+          <w:szCs w:val="17"/>
+        </w:rPr>
+        <w:t xml:space="preserve"> </w:t>
+      </w:r>
+    </w:p>
+    <w:p>
+      <w:pPr>
+        <w:keepLines/>
+        <w:shd w:fill="F2F4F7" w:val="clear"/>
+        <w:spacing w:after="0"/>
+        <w:ind w:left="100" w:right="100"/>
+      </w:pPr>
+      <w:r>
+        <w:rPr>
+          <w:rFonts w:ascii="Courier New" w:cs="Courier New" w:eastAsia="Courier New" w:hAnsi="Courier New"/>
+          <w:color w:val="1B2A4A"/>
+          <w:sz w:val="17"/>
+          <w:szCs w:val="17"/>
+        </w:rPr>
+        <w:t xml:space="preserve">"Our AC installations start at $4,000 for a 2.5-ton unit. That includes the unit, the coil, the copper line set, materials and labor,</w:t>
+      </w:r>
+    </w:p>
+    <w:p>
+      <w:pPr>
+        <w:keepLines/>
+        <w:shd w:fill="F2F4F7" w:val="clear"/>
+        <w:spacing w:after="0"/>
+        <w:ind w:left="100" w:right="100"/>
+      </w:pPr>
+      <w:r>
+        <w:rPr>
+          <w:rFonts w:ascii="Courier New" w:cs="Courier New" w:eastAsia="Courier New" w:hAnsi="Courier New"/>
+          <w:color w:val="1B2A4A"/>
+          <w:sz w:val="17"/>
+          <w:szCs w:val="17"/>
+        </w:rPr>
+        <w:t xml:space="preserve">installed in about one day, with a 10-year warranty, and the first 3 months parts and labor are free."</w:t>
+      </w:r>
+    </w:p>
+    <w:p>
+      <w:pPr>
+        <w:keepLines/>
+        <w:shd w:fill="F2F4F7" w:val="clear"/>
+        <w:spacing w:after="0"/>
+        <w:ind w:left="100" w:right="100"/>
+      </w:pPr>
+      <w:r>
+        <w:rPr>
+          <w:rFonts w:ascii="Courier New" w:cs="Courier New" w:eastAsia="Courier New" w:hAnsi="Courier New"/>
+          <w:color w:val="1B2A4A"/>
+          <w:sz w:val="17"/>
+          <w:szCs w:val="17"/>
+        </w:rPr>
+        <w:t xml:space="preserve">(La instalación de aire arranca en $4,000 para un equipo de 2.5 toneladas. Incluye el equipo, el coil, la línea de cobre, materiales y</w:t>
+      </w:r>
+    </w:p>
+    <w:p>
+      <w:pPr>
+        <w:keepLines/>
+        <w:shd w:fill="F2F4F7" w:val="clear"/>
+        <w:spacing w:after="0"/>
+        <w:ind w:left="100" w:right="100"/>
+      </w:pPr>
+      <w:r>
+        <w:rPr>
+          <w:rFonts w:ascii="Courier New" w:cs="Courier New" w:eastAsia="Courier New" w:hAnsi="Courier New"/>
+          <w:color w:val="1B2A4A"/>
+          <w:sz w:val="17"/>
+          <w:szCs w:val="17"/>
+        </w:rPr>
+        <w:t xml:space="preserve">mano de obra, instalado en más o menos un día, con 10 años de garantía y los primeros 3 meses pieza y mano de obra gratis.)</w:t>
+      </w:r>
+    </w:p>
+    <w:p>
+      <w:pPr>
+        <w:keepLines/>
+        <w:shd w:fill="F2F4F7" w:val="clear"/>
+        <w:spacing w:after="0"/>
+        <w:ind w:left="100" w:right="100"/>
+      </w:pPr>
+      <w:r>
+        <w:rPr>
+          <w:rFonts w:ascii="Courier New" w:cs="Courier New" w:eastAsia="Courier New" w:hAnsi="Courier New"/>
+          <w:color w:val="1B2A4A"/>
+          <w:sz w:val="17"/>
+          <w:szCs w:val="17"/>
+        </w:rPr>
+        <w:t xml:space="preserve"> </w:t>
+      </w:r>
+    </w:p>
+    <w:p>
+      <w:pPr>
+        <w:keepLines/>
+        <w:shd w:fill="F2F4F7" w:val="clear"/>
+        <w:spacing w:after="0"/>
+        <w:ind w:left="100" w:right="100"/>
+      </w:pPr>
+      <w:r>
+        <w:rPr>
+          <w:rFonts w:ascii="Courier New" w:cs="Courier New" w:eastAsia="Courier New" w:hAnsi="Courier New"/>
+          <w:color w:val="1B2A4A"/>
+          <w:sz w:val="17"/>
+          <w:szCs w:val="17"/>
+        </w:rPr>
+        <w:t xml:space="preserve">"The best next step is a free visit: our technician checks your home and gives you your exact price in about 20 minutes.</w:t>
+      </w:r>
+    </w:p>
+    <w:p>
+      <w:pPr>
+        <w:keepLines/>
+        <w:shd w:fill="F2F4F7" w:val="clear"/>
+        <w:spacing w:after="0"/>
+        <w:ind w:left="100" w:right="100"/>
+      </w:pPr>
+      <w:r>
+        <w:rPr>
+          <w:rFonts w:ascii="Courier New" w:cs="Courier New" w:eastAsia="Courier New" w:hAnsi="Courier New"/>
+          <w:color w:val="1B2A4A"/>
+          <w:sz w:val="17"/>
+          <w:szCs w:val="17"/>
+        </w:rPr>
+        <w:t xml:space="preserve">I have [Day] at [morning time] or [Day] at [afternoon time]. Which one works better?"</w:t>
+      </w:r>
+    </w:p>
+    <w:p>
+      <w:pPr>
+        <w:keepLines/>
+        <w:shd w:fill="F2F4F7" w:val="clear"/>
+        <w:spacing w:after="0"/>
+        <w:ind w:left="100" w:right="100"/>
+      </w:pPr>
+      <w:r>
+        <w:rPr>
+          <w:rFonts w:ascii="Courier New" w:cs="Courier New" w:eastAsia="Courier New" w:hAnsi="Courier New"/>
+          <w:color w:val="1B2A4A"/>
+          <w:sz w:val="17"/>
+          <w:szCs w:val="17"/>
+        </w:rPr>
+        <w:t xml:space="preserve">(Lo mejor es una visita gratis: el técnico revisa tu casa y te da el precio exacto en unos 20 minutos. ¿Te sirve [día/hora] o [día/hora]?)</w:t>
+      </w:r>
+    </w:p>
+    <w:p>
+      <w:pPr>
+        <w:spacing w:after="160"/>
+      </w:pPr>
+      <w:r>
+        <w:t xml:space="preserve"/>
+      </w:r>
+    </w:p>
+    <w:p>
+      <w:pPr>
+        <w:spacing w:after="110"/>
+      </w:pPr>
+      <w:r>
+        <w:rPr>
+          <w:rFonts w:ascii="Arial" w:cs="Arial" w:eastAsia="Arial" w:hAnsi="Arial"/>
+          <w:color w:val="333333"/>
+          <w:sz w:val="20"/>
+          <w:szCs w:val="20"/>
+        </w:rPr>
+        <w:t xml:space="preserve">Si dice que quiere cambiar </w:t>
+      </w:r>
+      <w:r>
+        <w:rPr>
+          <w:rFonts w:ascii="Arial" w:cs="Arial" w:eastAsia="Arial" w:hAnsi="Arial"/>
+          <w:b/>
+          <w:bCs/>
+          <w:color w:val="333333"/>
+          <w:sz w:val="20"/>
+          <w:szCs w:val="20"/>
+        </w:rPr>
+        <w:t xml:space="preserve">el aire y el furnace</w:t>
+      </w:r>
+      <w:r>
+        <w:rPr>
+          <w:rFonts w:ascii="Arial" w:cs="Arial" w:eastAsia="Arial" w:hAnsi="Arial"/>
+          <w:color w:val="333333"/>
+          <w:sz w:val="20"/>
+          <w:szCs w:val="20"/>
+        </w:rPr>
+        <w:t xml:space="preserve">: "If you're replacing both, the complete system is $6,500 — the technician confirms it at the visit." (Si cambias los dos, el sistema completo es $6,500; el técnico lo confirma en la visita.) Y vuelves a los 2 horarios. Si insiste en el precio por teléfono: "The exact price depends on your home, and the visit is free. [1] or [2]?" (El precio exacto depende de tu casa y la visita es gratis. ¿[1] o [2]?) Después: cierre del agendamiento (abajo) y nota, por ejemplo: "AC nuevo, el actual ya no enfría bien. Agendó visita [día, hora]."</w:t>
       </w:r>
     </w:p>
     <w:p>

</xml_diff>

<commit_message>
Aire Express setter: furnace replacement as a direct sale (photo, exact price, contract, install)
Co-Authored-By: Claude Opus 5.5 <noreply@anthropic.com>
</commit_message>
<xml_diff>
--- a/induccion-aire-express/guiones/docs/01_SPEECH_CONTACTABILIDAD.docx
+++ b/induccion-aire-express/guiones/docs/01_SPEECH_CONTACTABILIDAD.docx
@@ -54,7 +54,27 @@
           <w:sz w:val="20"/>
           <w:szCs w:val="20"/>
         </w:rPr>
-        <w:t xml:space="preserve"> agendar la visita en el calendario o, en reemplazo de furnace, dejar los 4 datos de la casa para que Juan David dé el precio por teléfono. Se termina con la visita agendada, los datos completos o el motivo anotado.</w:t>
+        <w:t xml:space="preserve"> agendar la visita en el calendario o, en reemplazo de furnace, </w:t>
+      </w:r>
+      <w:r>
+        <w:rPr>
+          <w:rFonts w:ascii="Arial" w:cs="Arial" w:eastAsia="Arial" w:hAnsi="Arial"/>
+          <w:b/>
+          <w:bCs/>
+          <w:color w:val="333333"/>
+          <w:sz w:val="20"/>
+          <w:szCs w:val="20"/>
+        </w:rPr>
+        <w:t xml:space="preserve">venderlo sin visita</w:t>
+      </w:r>
+      <w:r>
+        <w:rPr>
+          <w:rFonts w:ascii="Arial" w:cs="Arial" w:eastAsia="Arial" w:hAnsi="Arial"/>
+          <w:color w:val="333333"/>
+          <w:sz w:val="20"/>
+          <w:szCs w:val="20"/>
+        </w:rPr>
+        <w:t xml:space="preserve">: datos de la casa + foto del furnace → Juan David da el precio exacto → el cliente acepta, firma el contrato y queda el día de instalación (ver "VENTA DIRECTA DE REEMPLAZO"). Se termina con la visita o la instalación agendada, los datos y la foto pedidos, o el motivo anotado.</w:t>
       </w:r>
     </w:p>
     <w:p>
@@ -2421,7 +2441,27 @@
           <w:sz w:val="20"/>
           <w:szCs w:val="20"/>
         </w:rPr>
-        <w:t xml:space="preserve"> = *Not sure*: "No worries — is there a chimney or a vent pipe that goes up through the roof?" (¿Hay chimenea o un tubo que sale por el techo?). Después sigue igual que abajo: "Juan David, our installer, will review this and we'll call you back…".</w:t>
+        <w:t xml:space="preserve"> = *Not sure*: "No worries — is there a chimney or a vent pipe that goes up through the roof?" (¿Hay chimenea o un tubo que sale por el techo?). Después sigue con </w:t>
+      </w:r>
+      <w:r>
+        <w:rPr>
+          <w:rFonts w:ascii="Arial" w:cs="Arial" w:eastAsia="Arial" w:hAnsi="Arial"/>
+          <w:b/>
+          <w:bCs/>
+          <w:color w:val="333333"/>
+          <w:sz w:val="20"/>
+          <w:szCs w:val="20"/>
+        </w:rPr>
+        <w:t xml:space="preserve">"VENTA DIRECTA DE REEMPLAZO"</w:t>
+      </w:r>
+      <w:r>
+        <w:rPr>
+          <w:rFonts w:ascii="Arial" w:cs="Arial" w:eastAsia="Arial" w:hAnsi="Arial"/>
+          <w:color w:val="333333"/>
+          <w:sz w:val="20"/>
+          <w:szCs w:val="20"/>
+        </w:rPr>
+        <w:t xml:space="preserve"> (abajo): las preguntas para instalar, la foto y el cierre.</w:t>
       </w:r>
     </w:p>
     <w:p>
@@ -2834,91 +2874,6 @@
     </w:p>
     <w:p>
       <w:pPr>
-        <w:keepLines/>
-        <w:shd w:fill="F2F4F7" w:val="clear"/>
-        <w:spacing w:after="0"/>
-        <w:ind w:left="100" w:right="100"/>
-      </w:pPr>
-      <w:r>
-        <w:rPr>
-          <w:rFonts w:ascii="Courier New" w:cs="Courier New" w:eastAsia="Courier New" w:hAnsi="Courier New"/>
-          <w:color w:val="1B2A4A"/>
-          <w:sz w:val="17"/>
-          <w:szCs w:val="17"/>
-        </w:rPr>
-        <w:t xml:space="preserve">"Perfect. Juan David, our installer, will review this and we'll call you back [today / tomorrow morning] with your exact price.</w:t>
-      </w:r>
-    </w:p>
-    <w:p>
-      <w:pPr>
-        <w:keepLines/>
-        <w:shd w:fill="F2F4F7" w:val="clear"/>
-        <w:spacing w:after="0"/>
-        <w:ind w:left="100" w:right="100"/>
-      </w:pPr>
-      <w:r>
-        <w:rPr>
-          <w:rFonts w:ascii="Courier New" w:cs="Courier New" w:eastAsia="Courier New" w:hAnsi="Courier New"/>
-          <w:color w:val="1B2A4A"/>
-          <w:sz w:val="17"/>
-          <w:szCs w:val="17"/>
-        </w:rPr>
-        <w:t xml:space="preserve">Furnaces start at $2,350, installed in about one day, with a 5-year warranty, and the first 3 months parts and labor are free.</w:t>
-      </w:r>
-    </w:p>
-    <w:p>
-      <w:pPr>
-        <w:keepLines/>
-        <w:shd w:fill="F2F4F7" w:val="clear"/>
-        <w:spacing w:after="0"/>
-        <w:ind w:left="100" w:right="100"/>
-      </w:pPr>
-      <w:r>
-        <w:rPr>
-          <w:rFonts w:ascii="Courier New" w:cs="Courier New" w:eastAsia="Courier New" w:hAnsi="Courier New"/>
-          <w:color w:val="1B2A4A"/>
-          <w:sz w:val="17"/>
-          <w:szCs w:val="17"/>
-        </w:rPr>
-        <w:t xml:space="preserve">If you'd rather have him see it in person, that visit is free too."</w:t>
-      </w:r>
-    </w:p>
-    <w:p>
-      <w:pPr>
-        <w:keepLines/>
-        <w:shd w:fill="F2F4F7" w:val="clear"/>
-        <w:spacing w:after="0"/>
-        <w:ind w:left="100" w:right="100"/>
-      </w:pPr>
-      <w:r>
-        <w:rPr>
-          <w:rFonts w:ascii="Courier New" w:cs="Courier New" w:eastAsia="Courier New" w:hAnsi="Courier New"/>
-          <w:color w:val="1B2A4A"/>
-          <w:sz w:val="17"/>
-          <w:szCs w:val="17"/>
-        </w:rPr>
-        <w:t xml:space="preserve">(Perfecto. Juan David, nuestro instalador, revisa esto y te llamamos [hoy / mañana en la mañana] con el precio exacto.</w:t>
-      </w:r>
-    </w:p>
-    <w:p>
-      <w:pPr>
-        <w:keepLines/>
-        <w:shd w:fill="F2F4F7" w:val="clear"/>
-        <w:spacing w:after="0"/>
-        <w:ind w:left="100" w:right="100"/>
-      </w:pPr>
-      <w:r>
-        <w:rPr>
-          <w:rFonts w:ascii="Courier New" w:cs="Courier New" w:eastAsia="Courier New" w:hAnsi="Courier New"/>
-          <w:color w:val="1B2A4A"/>
-          <w:sz w:val="17"/>
-          <w:szCs w:val="17"/>
-        </w:rPr>
-        <w:t xml:space="preserve">El furnace arranca en $2,350, instalado en un día, 5 años de garantía y 3 meses gratis. Si prefieres que vaya a verlo en persona, esa visita también es gratis.)</w:t>
-      </w:r>
-    </w:p>
-    <w:p>
-      <w:pPr>
         <w:spacing w:after="160"/>
       </w:pPr>
       <w:r>
@@ -2936,27 +2891,1043 @@
           <w:sz w:val="20"/>
           <w:szCs w:val="20"/>
         </w:rPr>
-        <w:t xml:space="preserve">Después de colgar: nota con los 4 datos + dirección y ZIP, y aviso a Juan David para que dé el precio. </w:t>
-      </w:r>
-      <w:r>
-        <w:rPr>
-          <w:rFonts w:ascii="Arial" w:cs="Arial" w:eastAsia="Arial" w:hAnsi="Arial"/>
-          <w:b/>
-          <w:bCs/>
-          <w:color w:val="333333"/>
-          <w:sz w:val="20"/>
-          <w:szCs w:val="20"/>
-        </w:rPr>
-        <w:t xml:space="preserve">Tú no das el precio final</w:t>
-      </w:r>
-      <w:r>
-        <w:rPr>
-          <w:rFonts w:ascii="Arial" w:cs="Arial" w:eastAsia="Arial" w:hAnsi="Arial"/>
-          <w:color w:val="333333"/>
-          <w:sz w:val="20"/>
-          <w:szCs w:val="20"/>
-        </w:rPr>
-        <w:t xml:space="preserve">: solo el "desde $2,350". Si el cliente prefiere la visita, se agenda con los 2 horarios y la dirección (sin dirección no hay cita).</w:t>
+        <w:t xml:space="preserve">Sigue con </w:t>
+      </w:r>
+      <w:r>
+        <w:rPr>
+          <w:rFonts w:ascii="Arial" w:cs="Arial" w:eastAsia="Arial" w:hAnsi="Arial"/>
+          <w:b/>
+          <w:bCs/>
+          <w:color w:val="333333"/>
+          <w:sz w:val="20"/>
+          <w:szCs w:val="20"/>
+        </w:rPr>
+        <w:t xml:space="preserve">"VENTA DIRECTA DE REEMPLAZO"</w:t>
+      </w:r>
+      <w:r>
+        <w:rPr>
+          <w:rFonts w:ascii="Arial" w:cs="Arial" w:eastAsia="Arial" w:hAnsi="Arial"/>
+          <w:color w:val="333333"/>
+          <w:sz w:val="20"/>
+          <w:szCs w:val="20"/>
+        </w:rPr>
+        <w:t xml:space="preserve"> (abajo).</w:t>
+      </w:r>
+    </w:p>
+    <w:p>
+      <w:pPr>
+        <w:keepNext/>
+        <w:spacing w:after="80" w:before="220"/>
+      </w:pPr>
+      <w:r>
+        <w:rPr>
+          <w:rFonts w:ascii="Arial" w:cs="Arial" w:eastAsia="Arial" w:hAnsi="Arial"/>
+          <w:b/>
+          <w:bCs/>
+          <w:color w:val="2E75B6"/>
+          <w:sz w:val="22"/>
+          <w:szCs w:val="22"/>
+        </w:rPr>
+        <w:t xml:space="preserve">VENTA DIRECTA DE REEMPLAZO — se vende e instala sin visita (Juan David y JP, 19-oct)</w:t>
+      </w:r>
+    </w:p>
+    <w:p>
+      <w:pPr>
+        <w:spacing w:after="110"/>
+      </w:pPr>
+      <w:r>
+        <w:rPr>
+          <w:rFonts w:ascii="Arial" w:cs="Arial" w:eastAsia="Arial" w:hAnsi="Arial"/>
+          <w:b/>
+          <w:bCs/>
+          <w:color w:val="333333"/>
+          <w:sz w:val="20"/>
+          <w:szCs w:val="20"/>
+        </w:rPr>
+        <w:t xml:space="preserve">Por qué:</w:t>
+      </w:r>
+      <w:r>
+        <w:rPr>
+          <w:rFonts w:ascii="Arial" w:cs="Arial" w:eastAsia="Arial" w:hAnsi="Arial"/>
+          <w:color w:val="333333"/>
+          <w:sz w:val="20"/>
+          <w:szCs w:val="20"/>
+        </w:rPr>
+        <w:t xml:space="preserve"> en reemplazo no hace falta ir a cotizar. Con los datos de la casa y </w:t>
+      </w:r>
+      <w:r>
+        <w:rPr>
+          <w:rFonts w:ascii="Arial" w:cs="Arial" w:eastAsia="Arial" w:hAnsi="Arial"/>
+          <w:b/>
+          <w:bCs/>
+          <w:color w:val="333333"/>
+          <w:sz w:val="20"/>
+          <w:szCs w:val="20"/>
+        </w:rPr>
+        <w:t xml:space="preserve">la foto del furnace y su etiqueta</w:t>
+      </w:r>
+      <w:r>
+        <w:rPr>
+          <w:rFonts w:ascii="Arial" w:cs="Arial" w:eastAsia="Arial" w:hAnsi="Arial"/>
+          <w:color w:val="333333"/>
+          <w:sz w:val="20"/>
+          <w:szCs w:val="20"/>
+        </w:rPr>
+        <w:t xml:space="preserve">, Juan David sabe la medida, si es de gas y si va el de 80% o el de 96%, y da el precio exacto. Con 4 datos sin foto </w:t>
+      </w:r>
+      <w:r>
+        <w:rPr>
+          <w:rFonts w:ascii="Arial" w:cs="Arial" w:eastAsia="Arial" w:hAnsi="Arial"/>
+          <w:b/>
+          <w:bCs/>
+          <w:color w:val="333333"/>
+          <w:sz w:val="20"/>
+          <w:szCs w:val="20"/>
+        </w:rPr>
+        <w:t xml:space="preserve">no</w:t>
+      </w:r>
+      <w:r>
+        <w:rPr>
+          <w:rFonts w:ascii="Arial" w:cs="Arial" w:eastAsia="Arial" w:hAnsi="Arial"/>
+          <w:color w:val="333333"/>
+          <w:sz w:val="20"/>
+          <w:szCs w:val="20"/>
+        </w:rPr>
+        <w:t xml:space="preserve"> puede dar el precio (caso real 19-oct: Douglas y Crystal quedaron en visita porque no había foto). La visita en persona sigue siendo gratis, pero </w:t>
+      </w:r>
+      <w:r>
+        <w:rPr>
+          <w:rFonts w:ascii="Arial" w:cs="Arial" w:eastAsia="Arial" w:hAnsi="Arial"/>
+          <w:b/>
+          <w:bCs/>
+          <w:color w:val="333333"/>
+          <w:sz w:val="20"/>
+          <w:szCs w:val="20"/>
+        </w:rPr>
+        <w:t xml:space="preserve">solo si el cliente la pide</w:t>
+      </w:r>
+      <w:r>
+        <w:rPr>
+          <w:rFonts w:ascii="Arial" w:cs="Arial" w:eastAsia="Arial" w:hAnsi="Arial"/>
+          <w:color w:val="333333"/>
+          <w:sz w:val="20"/>
+          <w:szCs w:val="20"/>
+        </w:rPr>
+        <w:t xml:space="preserve">; no se ofrece por defecto.</w:t>
+      </w:r>
+    </w:p>
+    <w:p>
+      <w:pPr>
+        <w:spacing w:after="110"/>
+      </w:pPr>
+      <w:r>
+        <w:rPr>
+          <w:rFonts w:ascii="Arial" w:cs="Arial" w:eastAsia="Arial" w:hAnsi="Arial"/>
+          <w:b/>
+          <w:bCs/>
+          <w:color w:val="333333"/>
+          <w:sz w:val="20"/>
+          <w:szCs w:val="20"/>
+        </w:rPr>
+        <w:t xml:space="preserve">Llamada 1 — después de los datos de la casa, haz estas preguntas (todas):</w:t>
+      </w:r>
+    </w:p>
+    <w:p>
+      <w:pPr>
+        <w:keepLines/>
+        <w:shd w:fill="F2F4F7" w:val="clear"/>
+        <w:spacing w:after="0"/>
+        <w:ind w:left="100" w:right="100"/>
+      </w:pPr>
+      <w:r>
+        <w:rPr>
+          <w:rFonts w:ascii="Courier New" w:cs="Courier New" w:eastAsia="Courier New" w:hAnsi="Courier New"/>
+          <w:color w:val="1B2A4A"/>
+          <w:sz w:val="17"/>
+          <w:szCs w:val="17"/>
+        </w:rPr>
+        <w:t xml:space="preserve">"Do you live in the home, or is it a rental or an investment property?"</w:t>
+      </w:r>
+    </w:p>
+    <w:p>
+      <w:pPr>
+        <w:keepLines/>
+        <w:shd w:fill="F2F4F7" w:val="clear"/>
+        <w:spacing w:after="0"/>
+        <w:ind w:left="100" w:right="100"/>
+      </w:pPr>
+      <w:r>
+        <w:rPr>
+          <w:rFonts w:ascii="Courier New" w:cs="Courier New" w:eastAsia="Courier New" w:hAnsi="Courier New"/>
+          <w:color w:val="1B2A4A"/>
+          <w:sz w:val="17"/>
+          <w:szCs w:val="17"/>
+        </w:rPr>
+        <w:t xml:space="preserve">(¿Vives en la casa o es una propiedad de renta o de inversión?)</w:t>
+      </w:r>
+    </w:p>
+    <w:p>
+      <w:pPr>
+        <w:keepLines/>
+        <w:shd w:fill="F2F4F7" w:val="clear"/>
+        <w:spacing w:after="0"/>
+        <w:ind w:left="100" w:right="100"/>
+      </w:pPr>
+      <w:r>
+        <w:rPr>
+          <w:rFonts w:ascii="Courier New" w:cs="Courier New" w:eastAsia="Courier New" w:hAnsi="Courier New"/>
+          <w:color w:val="1B2A4A"/>
+          <w:sz w:val="17"/>
+          <w:szCs w:val="17"/>
+        </w:rPr>
+        <w:t xml:space="preserve"> </w:t>
+      </w:r>
+    </w:p>
+    <w:p>
+      <w:pPr>
+        <w:keepLines/>
+        <w:shd w:fill="F2F4F7" w:val="clear"/>
+        <w:spacing w:after="0"/>
+        <w:ind w:left="100" w:right="100"/>
+      </w:pPr>
+      <w:r>
+        <w:rPr>
+          <w:rFonts w:ascii="Courier New" w:cs="Courier New" w:eastAsia="Courier New" w:hAnsi="Courier New"/>
+          <w:color w:val="1B2A4A"/>
+          <w:sz w:val="17"/>
+          <w:szCs w:val="17"/>
+        </w:rPr>
+        <w:t xml:space="preserve">"Are you the one who signs for the work?"   (¿Eres tú quien firma el trabajo?)   ← si no, pide el nombre y el teléfono de quien firma</w:t>
+      </w:r>
+    </w:p>
+    <w:p>
+      <w:pPr>
+        <w:keepLines/>
+        <w:shd w:fill="F2F4F7" w:val="clear"/>
+        <w:spacing w:after="0"/>
+        <w:ind w:left="100" w:right="100"/>
+      </w:pPr>
+      <w:r>
+        <w:rPr>
+          <w:rFonts w:ascii="Courier New" w:cs="Courier New" w:eastAsia="Courier New" w:hAnsi="Courier New"/>
+          <w:color w:val="1B2A4A"/>
+          <w:sz w:val="17"/>
+          <w:szCs w:val="17"/>
+        </w:rPr>
+        <w:t xml:space="preserve"> </w:t>
+      </w:r>
+    </w:p>
+    <w:p>
+      <w:pPr>
+        <w:keepLines/>
+        <w:shd w:fill="F2F4F7" w:val="clear"/>
+        <w:spacing w:after="0"/>
+        <w:ind w:left="100" w:right="100"/>
+      </w:pPr>
+      <w:r>
+        <w:rPr>
+          <w:rFonts w:ascii="Courier New" w:cs="Courier New" w:eastAsia="Courier New" w:hAnsi="Courier New"/>
+          <w:color w:val="1B2A4A"/>
+          <w:sz w:val="17"/>
+          <w:szCs w:val="17"/>
+        </w:rPr>
+        <w:t xml:space="preserve">"Where is the furnace — basement, attic, closet or garage?"</w:t>
+      </w:r>
+    </w:p>
+    <w:p>
+      <w:pPr>
+        <w:keepLines/>
+        <w:shd w:fill="F2F4F7" w:val="clear"/>
+        <w:spacing w:after="0"/>
+        <w:ind w:left="100" w:right="100"/>
+      </w:pPr>
+      <w:r>
+        <w:rPr>
+          <w:rFonts w:ascii="Courier New" w:cs="Courier New" w:eastAsia="Courier New" w:hAnsi="Courier New"/>
+          <w:color w:val="1B2A4A"/>
+          <w:sz w:val="17"/>
+          <w:szCs w:val="17"/>
+        </w:rPr>
+        <w:t xml:space="preserve">(¿Dónde está el furnace: basement, ático, clóset o garaje?)</w:t>
+      </w:r>
+    </w:p>
+    <w:p>
+      <w:pPr>
+        <w:keepLines/>
+        <w:shd w:fill="F2F4F7" w:val="clear"/>
+        <w:spacing w:after="0"/>
+        <w:ind w:left="100" w:right="100"/>
+      </w:pPr>
+      <w:r>
+        <w:rPr>
+          <w:rFonts w:ascii="Courier New" w:cs="Courier New" w:eastAsia="Courier New" w:hAnsi="Courier New"/>
+          <w:color w:val="1B2A4A"/>
+          <w:sz w:val="17"/>
+          <w:szCs w:val="17"/>
+        </w:rPr>
+        <w:t xml:space="preserve"> </w:t>
+      </w:r>
+    </w:p>
+    <w:p>
+      <w:pPr>
+        <w:keepLines/>
+        <w:shd w:fill="F2F4F7" w:val="clear"/>
+        <w:spacing w:after="0"/>
+        <w:ind w:left="100" w:right="100"/>
+      </w:pPr>
+      <w:r>
+        <w:rPr>
+          <w:rFonts w:ascii="Courier New" w:cs="Courier New" w:eastAsia="Courier New" w:hAnsi="Courier New"/>
+          <w:color w:val="1B2A4A"/>
+          <w:sz w:val="17"/>
+          <w:szCs w:val="17"/>
+        </w:rPr>
+        <w:t xml:space="preserve">"When the job is done, how would you pay — cash, Zelle, Cash App or another app?"</w:t>
+      </w:r>
+    </w:p>
+    <w:p>
+      <w:pPr>
+        <w:keepLines/>
+        <w:shd w:fill="F2F4F7" w:val="clear"/>
+        <w:spacing w:after="0"/>
+        <w:ind w:left="100" w:right="100"/>
+      </w:pPr>
+      <w:r>
+        <w:rPr>
+          <w:rFonts w:ascii="Courier New" w:cs="Courier New" w:eastAsia="Courier New" w:hAnsi="Courier New"/>
+          <w:color w:val="1B2A4A"/>
+          <w:sz w:val="17"/>
+          <w:szCs w:val="17"/>
+        </w:rPr>
+        <w:t xml:space="preserve">(Cuando terminemos, ¿cómo pagarías: efectivo, Zelle, Cash App u otra app?)</w:t>
+      </w:r>
+    </w:p>
+    <w:p>
+      <w:pPr>
+        <w:keepLines/>
+        <w:shd w:fill="F2F4F7" w:val="clear"/>
+        <w:spacing w:after="0"/>
+        <w:ind w:left="100" w:right="100"/>
+      </w:pPr>
+      <w:r>
+        <w:rPr>
+          <w:rFonts w:ascii="Courier New" w:cs="Courier New" w:eastAsia="Courier New" w:hAnsi="Courier New"/>
+          <w:color w:val="1B2A4A"/>
+          <w:sz w:val="17"/>
+          <w:szCs w:val="17"/>
+        </w:rPr>
+        <w:t xml:space="preserve"> </w:t>
+      </w:r>
+    </w:p>
+    <w:p>
+      <w:pPr>
+        <w:keepLines/>
+        <w:shd w:fill="F2F4F7" w:val="clear"/>
+        <w:spacing w:after="0"/>
+        <w:ind w:left="100" w:right="100"/>
+      </w:pPr>
+      <w:r>
+        <w:rPr>
+          <w:rFonts w:ascii="Courier New" w:cs="Courier New" w:eastAsia="Courier New" w:hAnsi="Courier New"/>
+          <w:color w:val="1B2A4A"/>
+          <w:sz w:val="17"/>
+          <w:szCs w:val="17"/>
+        </w:rPr>
+        <w:t xml:space="preserve">"To give you your exact price today, Juan David needs a photo of your furnace and of the label on its side.</w:t>
+      </w:r>
+    </w:p>
+    <w:p>
+      <w:pPr>
+        <w:keepLines/>
+        <w:shd w:fill="F2F4F7" w:val="clear"/>
+        <w:spacing w:after="0"/>
+        <w:ind w:left="100" w:right="100"/>
+      </w:pPr>
+      <w:r>
+        <w:rPr>
+          <w:rFonts w:ascii="Courier New" w:cs="Courier New" w:eastAsia="Courier New" w:hAnsi="Courier New"/>
+          <w:color w:val="1B2A4A"/>
+          <w:sz w:val="17"/>
+          <w:szCs w:val="17"/>
+        </w:rPr>
+        <w:t xml:space="preserve">Can I text you so you can send them back?"</w:t>
+      </w:r>
+    </w:p>
+    <w:p>
+      <w:pPr>
+        <w:keepLines/>
+        <w:shd w:fill="F2F4F7" w:val="clear"/>
+        <w:spacing w:after="0"/>
+        <w:ind w:left="100" w:right="100"/>
+      </w:pPr>
+      <w:r>
+        <w:rPr>
+          <w:rFonts w:ascii="Courier New" w:cs="Courier New" w:eastAsia="Courier New" w:hAnsi="Courier New"/>
+          <w:color w:val="1B2A4A"/>
+          <w:sz w:val="17"/>
+          <w:szCs w:val="17"/>
+        </w:rPr>
+        <w:t xml:space="preserve">(Para darte el precio exacto hoy, Juan David necesita una foto del furnace y de la etiqueta del costado. ¿Te puedo escribir por texto para que me las mandes?)</w:t>
+      </w:r>
+    </w:p>
+    <w:p>
+      <w:pPr>
+        <w:keepLines/>
+        <w:shd w:fill="F2F4F7" w:val="clear"/>
+        <w:spacing w:after="0"/>
+        <w:ind w:left="100" w:right="100"/>
+      </w:pPr>
+      <w:r>
+        <w:rPr>
+          <w:rFonts w:ascii="Courier New" w:cs="Courier New" w:eastAsia="Courier New" w:hAnsi="Courier New"/>
+          <w:color w:val="1B2A4A"/>
+          <w:sz w:val="17"/>
+          <w:szCs w:val="17"/>
+        </w:rPr>
+        <w:t xml:space="preserve"> </w:t>
+      </w:r>
+    </w:p>
+    <w:p>
+      <w:pPr>
+        <w:keepLines/>
+        <w:shd w:fill="F2F4F7" w:val="clear"/>
+        <w:spacing w:after="0"/>
+        <w:ind w:left="100" w:right="100"/>
+      </w:pPr>
+      <w:r>
+        <w:rPr>
+          <w:rFonts w:ascii="Courier New" w:cs="Courier New" w:eastAsia="Courier New" w:hAnsi="Courier New"/>
+          <w:color w:val="1B2A4A"/>
+          <w:sz w:val="17"/>
+          <w:szCs w:val="17"/>
+        </w:rPr>
+        <w:t xml:space="preserve">"Perfect. As soon as I get the photos, Juan David gives me your exact price and I call you back today.</w:t>
+      </w:r>
+    </w:p>
+    <w:p>
+      <w:pPr>
+        <w:keepLines/>
+        <w:shd w:fill="F2F4F7" w:val="clear"/>
+        <w:spacing w:after="0"/>
+        <w:ind w:left="100" w:right="100"/>
+      </w:pPr>
+      <w:r>
+        <w:rPr>
+          <w:rFonts w:ascii="Courier New" w:cs="Courier New" w:eastAsia="Courier New" w:hAnsi="Courier New"/>
+          <w:color w:val="1B2A4A"/>
+          <w:sz w:val="17"/>
+          <w:szCs w:val="17"/>
+        </w:rPr>
+        <w:t xml:space="preserve">If it works for you, we send you the contract to sign and we schedule your installation — it takes about one day.</w:t>
+      </w:r>
+    </w:p>
+    <w:p>
+      <w:pPr>
+        <w:keepLines/>
+        <w:shd w:fill="F2F4F7" w:val="clear"/>
+        <w:spacing w:after="0"/>
+        <w:ind w:left="100" w:right="100"/>
+      </w:pPr>
+      <w:r>
+        <w:rPr>
+          <w:rFonts w:ascii="Courier New" w:cs="Courier New" w:eastAsia="Courier New" w:hAnsi="Courier New"/>
+          <w:color w:val="1B2A4A"/>
+          <w:sz w:val="17"/>
+          <w:szCs w:val="17"/>
+        </w:rPr>
+        <w:t xml:space="preserve">Furnaces start at $2,350, with a 5-year warranty, and the first 3 months parts and labor are free."</w:t>
+      </w:r>
+    </w:p>
+    <w:p>
+      <w:pPr>
+        <w:keepLines/>
+        <w:shd w:fill="F2F4F7" w:val="clear"/>
+        <w:spacing w:after="0"/>
+        <w:ind w:left="100" w:right="100"/>
+      </w:pPr>
+      <w:r>
+        <w:rPr>
+          <w:rFonts w:ascii="Courier New" w:cs="Courier New" w:eastAsia="Courier New" w:hAnsi="Courier New"/>
+          <w:color w:val="1B2A4A"/>
+          <w:sz w:val="17"/>
+          <w:szCs w:val="17"/>
+        </w:rPr>
+        <w:t xml:space="preserve">(Perfecto. Apenas me lleguen las fotos, Juan David me da tu precio exacto y te llamo hoy. Si te sirve, te mandamos el contrato</w:t>
+      </w:r>
+    </w:p>
+    <w:p>
+      <w:pPr>
+        <w:keepLines/>
+        <w:shd w:fill="F2F4F7" w:val="clear"/>
+        <w:spacing w:after="0"/>
+        <w:ind w:left="100" w:right="100"/>
+      </w:pPr>
+      <w:r>
+        <w:rPr>
+          <w:rFonts w:ascii="Courier New" w:cs="Courier New" w:eastAsia="Courier New" w:hAnsi="Courier New"/>
+          <w:color w:val="1B2A4A"/>
+          <w:sz w:val="17"/>
+          <w:szCs w:val="17"/>
+        </w:rPr>
+        <w:t xml:space="preserve">para firmar y agendamos la instalación, que toma más o menos un día. El furnace arranca en $2,350, con 5 años de garantía y 3 meses gratis.)</w:t>
+      </w:r>
+    </w:p>
+    <w:p>
+      <w:pPr>
+        <w:spacing w:after="160"/>
+      </w:pPr>
+      <w:r>
+        <w:t xml:space="preserve"/>
+      </w:r>
+    </w:p>
+    <w:p>
+      <w:pPr>
+        <w:spacing w:after="50"/>
+        <w:ind w:left="360" w:hanging="240"/>
+      </w:pPr>
+      <w:r>
+        <w:rPr>
+          <w:rFonts w:ascii="Arial" w:cs="Arial" w:eastAsia="Arial" w:hAnsi="Arial"/>
+          <w:b/>
+          <w:bCs/>
+          <w:color w:val="2E75B6"/>
+          <w:sz w:val="20"/>
+          <w:szCs w:val="20"/>
+        </w:rPr>
+        <w:t xml:space="preserve">• </w:t>
+      </w:r>
+      <w:r>
+        <w:rPr>
+          <w:rFonts w:ascii="Arial" w:cs="Arial" w:eastAsia="Arial" w:hAnsi="Arial"/>
+          <w:b/>
+          <w:bCs/>
+          <w:color w:val="333333"/>
+          <w:sz w:val="20"/>
+          <w:szCs w:val="20"/>
+        </w:rPr>
+        <w:t xml:space="preserve">Texto para la foto:</w:t>
+      </w:r>
+      <w:r>
+        <w:rPr>
+          <w:rFonts w:ascii="Arial" w:cs="Arial" w:eastAsia="Arial" w:hAnsi="Arial"/>
+          <w:color w:val="333333"/>
+          <w:sz w:val="20"/>
+          <w:szCs w:val="20"/>
+        </w:rPr>
+        <w:t xml:space="preserve"> solo si dijo que sí en la llamada (queda en la nota: "aceptó texto por llamada, [fecha]"). Si dice que no,</w:t>
+      </w:r>
+    </w:p>
+    <w:p>
+      <w:pPr>
+        <w:spacing w:after="110"/>
+      </w:pPr>
+      <w:r>
+        <w:rPr>
+          <w:rFonts w:ascii="Arial" w:cs="Arial" w:eastAsia="Arial" w:hAnsi="Arial"/>
+          <w:color w:val="333333"/>
+          <w:sz w:val="20"/>
+          <w:szCs w:val="20"/>
+        </w:rPr>
+        <w:t xml:space="preserve">  pide que la mande al correo.</w:t>
+      </w:r>
+    </w:p>
+    <w:p>
+      <w:pPr>
+        <w:spacing w:after="50"/>
+        <w:ind w:left="360" w:hanging="240"/>
+      </w:pPr>
+      <w:r>
+        <w:rPr>
+          <w:rFonts w:ascii="Arial" w:cs="Arial" w:eastAsia="Arial" w:hAnsi="Arial"/>
+          <w:b/>
+          <w:bCs/>
+          <w:color w:val="2E75B6"/>
+          <w:sz w:val="20"/>
+          <w:szCs w:val="20"/>
+        </w:rPr>
+        <w:t xml:space="preserve">• </w:t>
+      </w:r>
+      <w:r>
+        <w:rPr>
+          <w:rFonts w:ascii="Arial" w:cs="Arial" w:eastAsia="Arial" w:hAnsi="Arial"/>
+          <w:b/>
+          <w:bCs/>
+          <w:color w:val="333333"/>
+          <w:sz w:val="20"/>
+          <w:szCs w:val="20"/>
+        </w:rPr>
+        <w:t xml:space="preserve">Si vive en la casa:</w:t>
+      </w:r>
+      <w:r>
+        <w:rPr>
+          <w:rFonts w:ascii="Arial" w:cs="Arial" w:eastAsia="Arial" w:hAnsi="Arial"/>
+          <w:color w:val="333333"/>
+          <w:sz w:val="20"/>
+          <w:szCs w:val="20"/>
+        </w:rPr>
+        <w:t xml:space="preserve"> paga al terminar, con el contrato firmado </w:t>
+      </w:r>
+      <w:r>
+        <w:rPr>
+          <w:rFonts w:ascii="Arial" w:cs="Arial" w:eastAsia="Arial" w:hAnsi="Arial"/>
+          <w:b/>
+          <w:bCs/>
+          <w:color w:val="333333"/>
+          <w:sz w:val="20"/>
+          <w:szCs w:val="20"/>
+        </w:rPr>
+        <w:t xml:space="preserve">antes</w:t>
+      </w:r>
+      <w:r>
+        <w:rPr>
+          <w:rFonts w:ascii="Arial" w:cs="Arial" w:eastAsia="Arial" w:hAnsi="Arial"/>
+          <w:color w:val="333333"/>
+          <w:sz w:val="20"/>
+          <w:szCs w:val="20"/>
+        </w:rPr>
+        <w:t xml:space="preserve"> de empezar. </w:t>
+      </w:r>
+      <w:r>
+        <w:rPr>
+          <w:rFonts w:ascii="Arial" w:cs="Arial" w:eastAsia="Arial" w:hAnsi="Arial"/>
+          <w:b/>
+          <w:bCs/>
+          <w:color w:val="333333"/>
+          <w:sz w:val="20"/>
+          <w:szCs w:val="20"/>
+        </w:rPr>
+        <w:t xml:space="preserve">Si es renta o inversión:</w:t>
+      </w:r>
+      <w:r>
+        <w:rPr>
+          <w:rFonts w:ascii="Arial" w:cs="Arial" w:eastAsia="Arial" w:hAnsi="Arial"/>
+          <w:color w:val="333333"/>
+          <w:sz w:val="20"/>
+          <w:szCs w:val="20"/>
+        </w:rPr>
+        <w:t xml:space="preserve"> se pide</w:t>
+      </w:r>
+    </w:p>
+    <w:p>
+      <w:pPr>
+        <w:spacing w:after="110"/>
+      </w:pPr>
+      <w:r>
+        <w:rPr>
+          <w:rFonts w:ascii="Arial" w:cs="Arial" w:eastAsia="Arial" w:hAnsi="Arial"/>
+          <w:color w:val="333333"/>
+          <w:sz w:val="20"/>
+          <w:szCs w:val="20"/>
+        </w:rPr>
+        <w:t xml:space="preserve">  anticipo; tú no explicas montos: "Juan David will explain the deposit with your price." (Juan David te explica el anticipo con tu precio.)</w:t>
+      </w:r>
+    </w:p>
+    <w:p>
+      <w:pPr>
+        <w:spacing w:after="50"/>
+        <w:ind w:left="360" w:hanging="240"/>
+      </w:pPr>
+      <w:r>
+        <w:rPr>
+          <w:rFonts w:ascii="Arial" w:cs="Arial" w:eastAsia="Arial" w:hAnsi="Arial"/>
+          <w:b/>
+          <w:bCs/>
+          <w:color w:val="2E75B6"/>
+          <w:sz w:val="20"/>
+          <w:szCs w:val="20"/>
+        </w:rPr>
+        <w:t xml:space="preserve">• </w:t>
+      </w:r>
+      <w:r>
+        <w:rPr>
+          <w:rFonts w:ascii="Arial" w:cs="Arial" w:eastAsia="Arial" w:hAnsi="Arial"/>
+          <w:b/>
+          <w:bCs/>
+          <w:color w:val="333333"/>
+          <w:sz w:val="20"/>
+          <w:szCs w:val="20"/>
+        </w:rPr>
+        <w:t xml:space="preserve">Tú no das el precio exacto</w:t>
+      </w:r>
+      <w:r>
+        <w:rPr>
+          <w:rFonts w:ascii="Arial" w:cs="Arial" w:eastAsia="Arial" w:hAnsi="Arial"/>
+          <w:color w:val="333333"/>
+          <w:sz w:val="20"/>
+          <w:szCs w:val="20"/>
+        </w:rPr>
+        <w:t xml:space="preserve">: solo el "desde $2,350". El precio exacto lo da Juan David con la foto.</w:t>
+      </w:r>
+    </w:p>
+    <w:p>
+      <w:pPr>
+        <w:spacing w:after="110"/>
+      </w:pPr>
+      <w:r>
+        <w:rPr>
+          <w:rFonts w:ascii="Arial" w:cs="Arial" w:eastAsia="Arial" w:hAnsi="Arial"/>
+          <w:b/>
+          <w:bCs/>
+          <w:color w:val="333333"/>
+          <w:sz w:val="20"/>
+          <w:szCs w:val="20"/>
+        </w:rPr>
+        <w:t xml:space="preserve">Al colgar:</w:t>
+      </w:r>
+      <w:r>
+        <w:rPr>
+          <w:rFonts w:ascii="Arial" w:cs="Arial" w:eastAsia="Arial" w:hAnsi="Arial"/>
+          <w:color w:val="333333"/>
+          <w:sz w:val="20"/>
+          <w:szCs w:val="20"/>
+        </w:rPr>
+        <w:t xml:space="preserve"> nota con todo (abajo) y, apenas lleguen las fotos, mándalas al grupo de Juan David con los datos de la casa, la dirección, si vive en la casa y la forma de pago. Juan David responde el precio exacto </w:t>
+      </w:r>
+      <w:r>
+        <w:rPr>
+          <w:rFonts w:ascii="Arial" w:cs="Arial" w:eastAsia="Arial" w:hAnsi="Arial"/>
+          <w:b/>
+          <w:bCs/>
+          <w:color w:val="333333"/>
+          <w:sz w:val="20"/>
+          <w:szCs w:val="20"/>
+        </w:rPr>
+        <w:t xml:space="preserve">el mismo día</w:t>
+      </w:r>
+      <w:r>
+        <w:rPr>
+          <w:rFonts w:ascii="Arial" w:cs="Arial" w:eastAsia="Arial" w:hAnsi="Arial"/>
+          <w:color w:val="333333"/>
+          <w:sz w:val="20"/>
+          <w:szCs w:val="20"/>
+        </w:rPr>
+        <w:t xml:space="preserve">. Si en 24 horas no llegó la foto: llama (doble marcado) y, si no la puede mandar, ofrece la visita gratis con los 2 horarios.</w:t>
+      </w:r>
+    </w:p>
+    <w:p>
+      <w:pPr>
+        <w:spacing w:after="110"/>
+      </w:pPr>
+      <w:r>
+        <w:rPr>
+          <w:rFonts w:ascii="Arial" w:cs="Arial" w:eastAsia="Arial" w:hAnsi="Arial"/>
+          <w:b/>
+          <w:bCs/>
+          <w:color w:val="333333"/>
+          <w:sz w:val="20"/>
+          <w:szCs w:val="20"/>
+        </w:rPr>
+        <w:t xml:space="preserve">Llamada 2 — con el precio exacto de Juan David:</w:t>
+      </w:r>
+    </w:p>
+    <w:p>
+      <w:pPr>
+        <w:keepLines/>
+        <w:shd w:fill="F2F4F7" w:val="clear"/>
+        <w:spacing w:after="0"/>
+        <w:ind w:left="100" w:right="100"/>
+      </w:pPr>
+      <w:r>
+        <w:rPr>
+          <w:rFonts w:ascii="Courier New" w:cs="Courier New" w:eastAsia="Courier New" w:hAnsi="Courier New"/>
+          <w:color w:val="1B2A4A"/>
+          <w:sz w:val="17"/>
+          <w:szCs w:val="17"/>
+        </w:rPr>
+        <w:t xml:space="preserve">"Hi [Name], it's [your name] from Aire Express. Juan David reviewed your photos. Your exact price is $[price], installed in about one day,</w:t>
+      </w:r>
+    </w:p>
+    <w:p>
+      <w:pPr>
+        <w:keepLines/>
+        <w:shd w:fill="F2F4F7" w:val="clear"/>
+        <w:spacing w:after="0"/>
+        <w:ind w:left="100" w:right="100"/>
+      </w:pPr>
+      <w:r>
+        <w:rPr>
+          <w:rFonts w:ascii="Courier New" w:cs="Courier New" w:eastAsia="Courier New" w:hAnsi="Courier New"/>
+          <w:color w:val="1B2A4A"/>
+          <w:sz w:val="17"/>
+          <w:szCs w:val="17"/>
+        </w:rPr>
+        <w:t xml:space="preserve">with a 5-year warranty and the first 3 months parts and labor free. I can schedule your installation [Day] or [Day]. Which one works better?"</w:t>
+      </w:r>
+    </w:p>
+    <w:p>
+      <w:pPr>
+        <w:keepLines/>
+        <w:shd w:fill="F2F4F7" w:val="clear"/>
+        <w:spacing w:after="0"/>
+        <w:ind w:left="100" w:right="100"/>
+      </w:pPr>
+      <w:r>
+        <w:rPr>
+          <w:rFonts w:ascii="Courier New" w:cs="Courier New" w:eastAsia="Courier New" w:hAnsi="Courier New"/>
+          <w:color w:val="1B2A4A"/>
+          <w:sz w:val="17"/>
+          <w:szCs w:val="17"/>
+        </w:rPr>
+        <w:t xml:space="preserve">(Hola [nombre], soy [tu nombre] de Aire Express. Juan David revisó tus fotos. Tu precio exacto es $[precio], instalado en más o menos un día,</w:t>
+      </w:r>
+    </w:p>
+    <w:p>
+      <w:pPr>
+        <w:keepLines/>
+        <w:shd w:fill="F2F4F7" w:val="clear"/>
+        <w:spacing w:after="0"/>
+        <w:ind w:left="100" w:right="100"/>
+      </w:pPr>
+      <w:r>
+        <w:rPr>
+          <w:rFonts w:ascii="Courier New" w:cs="Courier New" w:eastAsia="Courier New" w:hAnsi="Courier New"/>
+          <w:color w:val="1B2A4A"/>
+          <w:sz w:val="17"/>
+          <w:szCs w:val="17"/>
+        </w:rPr>
+        <w:t xml:space="preserve">con 5 años de garantía y 3 meses gratis. Te puedo agendar la instalación el [día] o el [día]. ¿Cuál te sirve?)</w:t>
+      </w:r>
+    </w:p>
+    <w:p>
+      <w:pPr>
+        <w:keepLines/>
+        <w:shd w:fill="F2F4F7" w:val="clear"/>
+        <w:spacing w:after="0"/>
+        <w:ind w:left="100" w:right="100"/>
+      </w:pPr>
+      <w:r>
+        <w:rPr>
+          <w:rFonts w:ascii="Courier New" w:cs="Courier New" w:eastAsia="Courier New" w:hAnsi="Courier New"/>
+          <w:color w:val="1B2A4A"/>
+          <w:sz w:val="17"/>
+          <w:szCs w:val="17"/>
+        </w:rPr>
+        <w:t xml:space="preserve"> </w:t>
+      </w:r>
+    </w:p>
+    <w:p>
+      <w:pPr>
+        <w:keepLines/>
+        <w:shd w:fill="F2F4F7" w:val="clear"/>
+        <w:spacing w:after="0"/>
+        <w:ind w:left="100" w:right="100"/>
+      </w:pPr>
+      <w:r>
+        <w:rPr>
+          <w:rFonts w:ascii="Courier New" w:cs="Courier New" w:eastAsia="Courier New" w:hAnsi="Courier New"/>
+          <w:color w:val="1B2A4A"/>
+          <w:sz w:val="17"/>
+          <w:szCs w:val="17"/>
+        </w:rPr>
+        <w:t xml:space="preserve">"Great. I'm sending you the contract to [email]. Once it's signed, your installation day is confirmed."</w:t>
+      </w:r>
+    </w:p>
+    <w:p>
+      <w:pPr>
+        <w:keepLines/>
+        <w:shd w:fill="F2F4F7" w:val="clear"/>
+        <w:spacing w:after="0"/>
+        <w:ind w:left="100" w:right="100"/>
+      </w:pPr>
+      <w:r>
+        <w:rPr>
+          <w:rFonts w:ascii="Courier New" w:cs="Courier New" w:eastAsia="Courier New" w:hAnsi="Courier New"/>
+          <w:color w:val="1B2A4A"/>
+          <w:sz w:val="17"/>
+          <w:szCs w:val="17"/>
+        </w:rPr>
+        <w:t xml:space="preserve">(Listo. Te mando el contrato a [correo]. Apenas lo firmes, queda confirmado el día de la instalación.)</w:t>
+      </w:r>
+    </w:p>
+    <w:p>
+      <w:pPr>
+        <w:spacing w:after="160"/>
+      </w:pPr>
+      <w:r>
+        <w:t xml:space="preserve"/>
+      </w:r>
+    </w:p>
+    <w:p>
+      <w:pPr>
+        <w:spacing w:after="50"/>
+        <w:ind w:left="360" w:hanging="240"/>
+      </w:pPr>
+      <w:r>
+        <w:rPr>
+          <w:rFonts w:ascii="Arial" w:cs="Arial" w:eastAsia="Arial" w:hAnsi="Arial"/>
+          <w:b/>
+          <w:bCs/>
+          <w:color w:val="2E75B6"/>
+          <w:sz w:val="20"/>
+          <w:szCs w:val="20"/>
+        </w:rPr>
+        <w:t xml:space="preserve">• </w:t>
+      </w:r>
+      <w:r>
+        <w:rPr>
+          <w:rFonts w:ascii="Arial" w:cs="Arial" w:eastAsia="Arial" w:hAnsi="Arial"/>
+          <w:b/>
+          <w:bCs/>
+          <w:color w:val="333333"/>
+          <w:sz w:val="20"/>
+          <w:szCs w:val="20"/>
+        </w:rPr>
+        <w:t xml:space="preserve">Sin contrato firmado no se carga el furnace.</w:t>
+      </w:r>
+      <w:r>
+        <w:rPr>
+          <w:rFonts w:ascii="Arial" w:cs="Arial" w:eastAsia="Arial" w:hAnsi="Arial"/>
+          <w:color w:val="333333"/>
+          <w:sz w:val="20"/>
+          <w:szCs w:val="20"/>
+        </w:rPr>
+        <w:t xml:space="preserve"> Si no lo puede firmar en el celular: por correo o en papel el día de la instalación,</w:t>
+      </w:r>
+    </w:p>
+    <w:p>
+      <w:pPr>
+        <w:spacing w:after="110"/>
+      </w:pPr>
+      <w:r>
+        <w:rPr>
+          <w:rFonts w:ascii="Arial" w:cs="Arial" w:eastAsia="Arial" w:hAnsi="Arial"/>
+          <w:color w:val="333333"/>
+          <w:sz w:val="20"/>
+          <w:szCs w:val="20"/>
+        </w:rPr>
+        <w:t xml:space="preserve">  antes de empezar.</w:t>
+      </w:r>
+    </w:p>
+    <w:p>
+      <w:pPr>
+        <w:spacing w:after="50"/>
+        <w:ind w:left="360" w:hanging="240"/>
+      </w:pPr>
+      <w:r>
+        <w:rPr>
+          <w:rFonts w:ascii="Arial" w:cs="Arial" w:eastAsia="Arial" w:hAnsi="Arial"/>
+          <w:b/>
+          <w:bCs/>
+          <w:color w:val="2E75B6"/>
+          <w:sz w:val="20"/>
+          <w:szCs w:val="20"/>
+        </w:rPr>
+        <w:t xml:space="preserve">• </w:t>
+      </w:r>
+      <w:r>
+        <w:rPr>
+          <w:rFonts w:ascii="Arial" w:cs="Arial" w:eastAsia="Arial" w:hAnsi="Arial"/>
+          <w:color w:val="333333"/>
+          <w:sz w:val="20"/>
+          <w:szCs w:val="20"/>
+        </w:rPr>
+        <w:t xml:space="preserve">La instalación va al calendario como </w:t>
+      </w:r>
+      <w:r>
+        <w:rPr>
+          <w:rFonts w:ascii="Arial" w:cs="Arial" w:eastAsia="Arial" w:hAnsi="Arial"/>
+          <w:b/>
+          <w:bCs/>
+          <w:color w:val="333333"/>
+          <w:sz w:val="20"/>
+          <w:szCs w:val="20"/>
+        </w:rPr>
+        <w:t xml:space="preserve">"INSTALACIÓN furnace — [nombre]"</w:t>
+      </w:r>
+      <w:r>
+        <w:rPr>
+          <w:rFonts w:ascii="Arial" w:cs="Arial" w:eastAsia="Arial" w:hAnsi="Arial"/>
+          <w:color w:val="333333"/>
+          <w:sz w:val="20"/>
+          <w:szCs w:val="20"/>
+        </w:rPr>
+        <w:t xml:space="preserve">, con dirección completa, y la oportunidad pasa a</w:t>
+      </w:r>
+    </w:p>
+    <w:p>
+      <w:pPr>
+        <w:spacing w:after="110"/>
+      </w:pPr>
+      <w:r>
+        <w:rPr>
+          <w:rFonts w:ascii="Arial" w:cs="Arial" w:eastAsia="Arial" w:hAnsi="Arial"/>
+          <w:color w:val="333333"/>
+          <w:sz w:val="20"/>
+          <w:szCs w:val="20"/>
+        </w:rPr>
+        <w:t xml:space="preserve">  </w:t>
+      </w:r>
+      <w:r>
+        <w:rPr>
+          <w:rFonts w:ascii="Arial" w:cs="Arial" w:eastAsia="Arial" w:hAnsi="Arial"/>
+          <w:b/>
+          <w:bCs/>
+          <w:color w:val="333333"/>
+          <w:sz w:val="20"/>
+          <w:szCs w:val="20"/>
+        </w:rPr>
+        <w:t xml:space="preserve">Proposal Sent</w:t>
+      </w:r>
+      <w:r>
+        <w:rPr>
+          <w:rFonts w:ascii="Arial" w:cs="Arial" w:eastAsia="Arial" w:hAnsi="Arial"/>
+          <w:color w:val="333333"/>
+          <w:sz w:val="20"/>
+          <w:szCs w:val="20"/>
+        </w:rPr>
+        <w:t xml:space="preserve"> con el valor.</w:t>
+      </w:r>
+    </w:p>
+    <w:p>
+      <w:pPr>
+        <w:spacing w:after="50"/>
+        <w:ind w:left="360" w:hanging="240"/>
+      </w:pPr>
+      <w:r>
+        <w:rPr>
+          <w:rFonts w:ascii="Arial" w:cs="Arial" w:eastAsia="Arial" w:hAnsi="Arial"/>
+          <w:b/>
+          <w:bCs/>
+          <w:color w:val="2E75B6"/>
+          <w:sz w:val="20"/>
+          <w:szCs w:val="20"/>
+        </w:rPr>
+        <w:t xml:space="preserve">• </w:t>
+      </w:r>
+      <w:r>
+        <w:rPr>
+          <w:rFonts w:ascii="Arial" w:cs="Arial" w:eastAsia="Arial" w:hAnsi="Arial"/>
+          <w:color w:val="333333"/>
+          <w:sz w:val="20"/>
+          <w:szCs w:val="20"/>
+        </w:rPr>
+        <w:t xml:space="preserve">Si duda o pide verlo en persona: "Of course — the visit is free. [1] or [2]?" y se agenda la visita como siempre.</w:t>
+      </w:r>
+    </w:p>
+    <w:p>
+      <w:pPr>
+        <w:spacing w:after="50"/>
+        <w:ind w:left="360" w:hanging="240"/>
+      </w:pPr>
+      <w:r>
+        <w:rPr>
+          <w:rFonts w:ascii="Arial" w:cs="Arial" w:eastAsia="Arial" w:hAnsi="Arial"/>
+          <w:b/>
+          <w:bCs/>
+          <w:color w:val="2E75B6"/>
+          <w:sz w:val="20"/>
+          <w:szCs w:val="20"/>
+        </w:rPr>
+        <w:t xml:space="preserve">• </w:t>
+      </w:r>
+      <w:r>
+        <w:rPr>
+          <w:rFonts w:ascii="Arial" w:cs="Arial" w:eastAsia="Arial" w:hAnsi="Arial"/>
+          <w:color w:val="333333"/>
+          <w:sz w:val="20"/>
+          <w:szCs w:val="20"/>
+        </w:rPr>
+        <w:t xml:space="preserve">Las objeciones de precio en esta llamada se responden con la tabla de la Inducción (2.2) y terminan en los 2 días de instalación.</w:t>
       </w:r>
     </w:p>
     <w:p>
@@ -4256,7 +5227,47 @@
           <w:sz w:val="20"/>
           <w:szCs w:val="20"/>
         </w:rPr>
-        <w:t xml:space="preserve"> (JP 13-oct): si el cliente dice que no quiere adelantar dinero: "No problem — you can sign the contract and pay when the job is done." (Sin problema: firmas el contrato y pagas cuando terminamos.) y vuelves a los 2 horarios. Si pregunta por financiamiento: "We don't work with financing companies. Payment options are explained at the visit, with your exact price. [1] or [2]?"</w:t>
+        <w:t xml:space="preserve"> (JP 13-oct): si el cliente dice que no quiere adelantar dinero: "No problem — you can sign the contract and pay when the job is done." (Sin problema: firmas el contrato y pagas cuando terminamos.) y vuelves a los 2 horarios. Si pregunta por financiamiento: "We don't work with financing companies. Payment options are explained at the visit, with your exact price. [1] or [2]?" </w:t>
+      </w:r>
+      <w:r>
+        <w:rPr>
+          <w:rFonts w:ascii="Arial" w:cs="Arial" w:eastAsia="Arial" w:hAnsi="Arial"/>
+          <w:b/>
+          <w:bCs/>
+          <w:color w:val="333333"/>
+          <w:sz w:val="20"/>
+          <w:szCs w:val="20"/>
+        </w:rPr>
+        <w:t xml:space="preserve">Reemplazo con venta directa (JP 19-oct):</w:t>
+      </w:r>
+      <w:r>
+        <w:rPr>
+          <w:rFonts w:ascii="Arial" w:cs="Arial" w:eastAsia="Arial" w:hAnsi="Arial"/>
+          <w:color w:val="333333"/>
+          <w:sz w:val="20"/>
+          <w:szCs w:val="20"/>
+        </w:rPr>
+        <w:t xml:space="preserve"> ahí sí </w:t>
+      </w:r>
+      <w:r>
+        <w:rPr>
+          <w:rFonts w:ascii="Arial" w:cs="Arial" w:eastAsia="Arial" w:hAnsi="Arial"/>
+          <w:b/>
+          <w:bCs/>
+          <w:color w:val="333333"/>
+          <w:sz w:val="20"/>
+          <w:szCs w:val="20"/>
+        </w:rPr>
+        <w:t xml:space="preserve">preguntas</w:t>
+      </w:r>
+      <w:r>
+        <w:rPr>
+          <w:rFonts w:ascii="Arial" w:cs="Arial" w:eastAsia="Arial" w:hAnsi="Arial"/>
+          <w:color w:val="333333"/>
+          <w:sz w:val="20"/>
+          <w:szCs w:val="20"/>
+        </w:rPr>
+        <w:t xml:space="preserve"> (no explicas) cómo va a pagar y si vive en la casa o es renta/inversión, porque no hay visita donde el técnico lo pregunte. Montos de anticipo y condiciones los explica Juan David.</w:t>
       </w:r>
     </w:p>
     <w:p>
@@ -4309,7 +5320,7 @@
           <w:sz w:val="17"/>
           <w:szCs w:val="17"/>
         </w:rPr>
-        <w:t xml:space="preserve">Detalle: furnace de 20 años, quiere cambiarlo antes del invierno. Casa de 2 pisos, basement habitable, sin chimenea. 123 Main St, Columbus 43227. Pasado a Juan David para el precio.</w:t>
+        <w:t xml:space="preserve">Detalle: furnace de 20 años, quiere cambiarlo antes del invierno. Casa de 2 pisos, basement habitable, sin chimenea. 123 Main St, Columbus 43227. Furnace en el basement. Vive en la casa, firma ella, paga con Zelle al terminar. Aceptó texto por llamada (19-oct); fotos del furnace y la etiqueta enviadas al grupo. Pasado a Juan David para el precio.</w:t>
       </w:r>
     </w:p>
     <w:p>
@@ -4331,7 +5342,7 @@
           <w:sz w:val="20"/>
           <w:szCs w:val="20"/>
         </w:rPr>
-        <w:t xml:space="preserve">Resultados: Agendó · Cotización por teléfono (datos completos) · Reprogramó · No interesado · Objeción — precio · Objeción — tiempo · Ya contrató a otro · No disponible · Sin respuesta · Fuera de zona · Urgencia atendida.</w:t>
+        <w:t xml:space="preserve">Resultados: Agendó · Cotización por teléfono (datos completos) · Esperando foto · Instalación agendada (contrato enviado) · Reprogramó · No interesado · Objeción — precio · Objeción — tiempo · Ya contrató a otro · No disponible · Sin respuesta · Fuera de zona · Urgencia atendida.</w:t>
       </w:r>
     </w:p>
     <w:sectPr>

</xml_diff>

<commit_message>
Aire Express setter: contract is sent on call 2 and signed before work starts
Co-Authored-By: Claude Opus 5.5 <noreply@anthropic.com>
</commit_message>
<xml_diff>
--- a/induccion-aire-express/guiones/docs/01_SPEECH_CONTACTABILIDAD.docx
+++ b/induccion-aire-express/guiones/docs/01_SPEECH_CONTACTABILIDAD.docx
@@ -3772,16 +3772,16 @@
           <w:sz w:val="20"/>
           <w:szCs w:val="20"/>
         </w:rPr>
-        <w:t xml:space="preserve">Sin contrato firmado no se carga el furnace.</w:t>
-      </w:r>
-      <w:r>
-        <w:rPr>
-          <w:rFonts w:ascii="Arial" w:cs="Arial" w:eastAsia="Arial" w:hAnsi="Arial"/>
-          <w:color w:val="333333"/>
-          <w:sz w:val="20"/>
-          <w:szCs w:val="20"/>
-        </w:rPr>
-        <w:t xml:space="preserve"> Si no lo puede firmar en el celular: por correo o en papel el día de la instalación,</w:t>
+        <w:t xml:space="preserve">El contrato se manda en esta llamada</w:t>
+      </w:r>
+      <w:r>
+        <w:rPr>
+          <w:rFonts w:ascii="Arial" w:cs="Arial" w:eastAsia="Arial" w:hAnsi="Arial"/>
+          <w:color w:val="333333"/>
+          <w:sz w:val="20"/>
+          <w:szCs w:val="20"/>
+        </w:rPr>
+        <w:t xml:space="preserve"> (link de GHL al correo) para que lo firme antes del día de instalación: así Juan David</w:t>
       </w:r>
     </w:p>
     <w:p>
@@ -3795,7 +3795,27 @@
           <w:sz w:val="20"/>
           <w:szCs w:val="20"/>
         </w:rPr>
-        <w:t xml:space="preserve">  antes de empezar.</w:t>
+        <w:t xml:space="preserve">  sabe que la venta es en firme antes de cargar el furnace. Si no lo puede firmar en el celular: por correo, o en papel en la casa </w:t>
+      </w:r>
+      <w:r>
+        <w:rPr>
+          <w:rFonts w:ascii="Arial" w:cs="Arial" w:eastAsia="Arial" w:hAnsi="Arial"/>
+          <w:b/>
+          <w:bCs/>
+          <w:color w:val="333333"/>
+          <w:sz w:val="20"/>
+          <w:szCs w:val="20"/>
+        </w:rPr>
+        <w:t xml:space="preserve">antes de empezar el trabajo</w:t>
+      </w:r>
+      <w:r>
+        <w:rPr>
+          <w:rFonts w:ascii="Arial" w:cs="Arial" w:eastAsia="Arial" w:hAnsi="Arial"/>
+          <w:color w:val="333333"/>
+          <w:sz w:val="20"/>
+          <w:szCs w:val="20"/>
+        </w:rPr>
+        <w:t xml:space="preserve">. Nunca se empieza a trabajar sin contrato firmado (Juan David, 19-oct).</w:t>
       </w:r>
     </w:p>
     <w:p>

</xml_diff>

<commit_message>
Aire Express setter: automatic replacement contract by SMS (fields + Proposal Sent)
Co-Authored-By: Claude Opus 5.5 <noreply@anthropic.com>
</commit_message>
<xml_diff>
--- a/induccion-aire-express/guiones/docs/01_SPEECH_CONTACTABILIDAD.docx
+++ b/induccion-aire-express/guiones/docs/01_SPEECH_CONTACTABILIDAD.docx
@@ -3719,24 +3719,58 @@
           <w:sz w:val="17"/>
           <w:szCs w:val="17"/>
         </w:rPr>
-        <w:t xml:space="preserve">"Great. I'm sending you the contract to [email]. Once it's signed, your installation day is confirmed."</w:t>
-      </w:r>
-    </w:p>
-    <w:p>
-      <w:pPr>
-        <w:keepLines/>
-        <w:shd w:fill="F2F4F7" w:val="clear"/>
-        <w:spacing w:after="0"/>
-        <w:ind w:left="100" w:right="100"/>
-      </w:pPr>
-      <w:r>
-        <w:rPr>
-          <w:rFonts w:ascii="Courier New" w:cs="Courier New" w:eastAsia="Courier New" w:hAnsi="Courier New"/>
-          <w:color w:val="1B2A4A"/>
-          <w:sz w:val="17"/>
-          <w:szCs w:val="17"/>
-        </w:rPr>
-        <w:t xml:space="preserve">(Listo. Te mando el contrato a [correo]. Apenas lo firmes, queda confirmado el día de la instalación.)</w:t>
+        <w:t xml:space="preserve">"Great. I'll text you the contract right now so you can sign it from your phone. Is it OK to text you at this number?"</w:t>
+      </w:r>
+    </w:p>
+    <w:p>
+      <w:pPr>
+        <w:keepLines/>
+        <w:shd w:fill="F2F4F7" w:val="clear"/>
+        <w:spacing w:after="0"/>
+        <w:ind w:left="100" w:right="100"/>
+      </w:pPr>
+      <w:r>
+        <w:rPr>
+          <w:rFonts w:ascii="Courier New" w:cs="Courier New" w:eastAsia="Courier New" w:hAnsi="Courier New"/>
+          <w:color w:val="1B2A4A"/>
+          <w:sz w:val="17"/>
+          <w:szCs w:val="17"/>
+        </w:rPr>
+        <w:t xml:space="preserve">(Listo. Te mando el contrato por mensaje de texto ahora para que lo firmes desde el celular. ¿Te lo puedo mandar a este número?)</w:t>
+      </w:r>
+    </w:p>
+    <w:p>
+      <w:pPr>
+        <w:keepLines/>
+        <w:shd w:fill="F2F4F7" w:val="clear"/>
+        <w:spacing w:after="0"/>
+        <w:ind w:left="100" w:right="100"/>
+      </w:pPr>
+      <w:r>
+        <w:rPr>
+          <w:rFonts w:ascii="Courier New" w:cs="Courier New" w:eastAsia="Courier New" w:hAnsi="Courier New"/>
+          <w:color w:val="1B2A4A"/>
+          <w:sz w:val="17"/>
+          <w:szCs w:val="17"/>
+        </w:rPr>
+        <w:t xml:space="preserve"> </w:t>
+      </w:r>
+    </w:p>
+    <w:p>
+      <w:pPr>
+        <w:keepLines/>
+        <w:shd w:fill="F2F4F7" w:val="clear"/>
+        <w:spacing w:after="0"/>
+        <w:ind w:left="100" w:right="100"/>
+      </w:pPr>
+      <w:r>
+        <w:rPr>
+          <w:rFonts w:ascii="Courier New" w:cs="Courier New" w:eastAsia="Courier New" w:hAnsi="Courier New"/>
+          <w:color w:val="1B2A4A"/>
+          <w:sz w:val="17"/>
+          <w:szCs w:val="17"/>
+        </w:rPr>
+        <w:t xml:space="preserve">"Once it's signed, your installation day is confirmed."   (Apenas lo firmes, queda confirmado el día de la instalación.)</w:t>
       </w:r>
     </w:p>
     <w:p>
@@ -3745,6 +3779,541 @@
       </w:pPr>
       <w:r>
         <w:t xml:space="preserve"/>
+      </w:r>
+    </w:p>
+    <w:p>
+      <w:pPr>
+        <w:spacing w:after="110"/>
+      </w:pPr>
+      <w:r>
+        <w:rPr>
+          <w:rFonts w:ascii="Arial" w:cs="Arial" w:eastAsia="Arial" w:hAnsi="Arial"/>
+          <w:b/>
+          <w:bCs/>
+          <w:color w:val="333333"/>
+          <w:sz w:val="20"/>
+          <w:szCs w:val="20"/>
+        </w:rPr>
+        <w:t xml:space="preserve">Cómo sale el contrato (automático, no lo escribes tú):</w:t>
+      </w:r>
+      <w:r>
+        <w:rPr>
+          <w:rFonts w:ascii="Arial" w:cs="Arial" w:eastAsia="Arial" w:hAnsi="Arial"/>
+          <w:color w:val="333333"/>
+          <w:sz w:val="20"/>
+          <w:szCs w:val="20"/>
+        </w:rPr>
+        <w:t xml:space="preserve"> solo si dijo que sí al texto, en el contacto (Additional Info) llenas:</w:t>
+      </w:r>
+    </w:p>
+    <w:tbl>
+      <w:tblPr>
+        <w:tblW w:type="dxa" w:w="9972"/>
+        <w:tblBorders>
+          <w:top w:val="single" w:color="auto" w:sz="4"/>
+          <w:left w:val="single" w:color="auto" w:sz="4"/>
+          <w:bottom w:val="single" w:color="auto" w:sz="4"/>
+          <w:right w:val="single" w:color="auto" w:sz="4"/>
+          <w:insideH w:val="single" w:color="auto" w:sz="4"/>
+          <w:insideV w:val="single" w:color="auto" w:sz="4"/>
+        </w:tblBorders>
+      </w:tblPr>
+      <w:tblGrid>
+        <w:gridCol w:w="3391"/>
+        <w:gridCol w:w="6581"/>
+      </w:tblGrid>
+      <w:tr>
+        <w:trPr>
+          <w:tblHeader/>
+        </w:trPr>
+        <w:tc>
+          <w:tcPr>
+            <w:tcW w:type="dxa" w:w="3391"/>
+            <w:tcBorders>
+              <w:top w:val="single" w:color="CCCCCC" w:sz="1"/>
+              <w:left w:val="single" w:color="CCCCCC" w:sz="1"/>
+              <w:bottom w:val="single" w:color="CCCCCC" w:sz="1"/>
+              <w:right w:val="single" w:color="CCCCCC" w:sz="1"/>
+            </w:tcBorders>
+            <w:shd w:fill="1B2A4A" w:val="clear"/>
+            <w:tcMar>
+              <w:top w:type="dxa" w:w="70"/>
+              <w:left w:type="dxa" w:w="100"/>
+              <w:bottom w:type="dxa" w:w="70"/>
+              <w:right w:type="dxa" w:w="100"/>
+            </w:tcMar>
+          </w:tcPr>
+          <w:p>
+            <w:pPr>
+              <w:spacing w:after="0"/>
+              <w:jc w:val="left"/>
+            </w:pPr>
+            <w:r>
+              <w:rPr>
+                <w:rFonts w:ascii="Arial" w:cs="Arial" w:eastAsia="Arial" w:hAnsi="Arial"/>
+                <w:b/>
+                <w:bCs/>
+                <w:color w:val="FFFFFF"/>
+                <w:sz w:val="18"/>
+                <w:szCs w:val="18"/>
+              </w:rPr>
+              <w:t xml:space="preserve">Campo</w:t>
+            </w:r>
+          </w:p>
+        </w:tc>
+        <w:tc>
+          <w:tcPr>
+            <w:tcW w:type="dxa" w:w="6581"/>
+            <w:tcBorders>
+              <w:top w:val="single" w:color="CCCCCC" w:sz="1"/>
+              <w:left w:val="single" w:color="CCCCCC" w:sz="1"/>
+              <w:bottom w:val="single" w:color="CCCCCC" w:sz="1"/>
+              <w:right w:val="single" w:color="CCCCCC" w:sz="1"/>
+            </w:tcBorders>
+            <w:shd w:fill="1B2A4A" w:val="clear"/>
+            <w:tcMar>
+              <w:top w:type="dxa" w:w="70"/>
+              <w:left w:type="dxa" w:w="100"/>
+              <w:bottom w:type="dxa" w:w="70"/>
+              <w:right w:type="dxa" w:w="100"/>
+            </w:tcMar>
+          </w:tcPr>
+          <w:p>
+            <w:pPr>
+              <w:spacing w:after="0"/>
+              <w:jc w:val="left"/>
+            </w:pPr>
+            <w:r>
+              <w:rPr>
+                <w:rFonts w:ascii="Arial" w:cs="Arial" w:eastAsia="Arial" w:hAnsi="Arial"/>
+                <w:b/>
+                <w:bCs/>
+                <w:color w:val="FFFFFF"/>
+                <w:sz w:val="18"/>
+                <w:szCs w:val="18"/>
+              </w:rPr>
+              <w:t xml:space="preserve">Qué pones</w:t>
+            </w:r>
+          </w:p>
+        </w:tc>
+      </w:tr>
+      <w:tr>
+        <w:trPr>
+          <w:cantSplit/>
+        </w:trPr>
+        <w:tc>
+          <w:tcPr>
+            <w:tcW w:type="dxa" w:w="3391"/>
+            <w:tcBorders>
+              <w:top w:val="single" w:color="CCCCCC" w:sz="1"/>
+              <w:left w:val="single" w:color="CCCCCC" w:sz="1"/>
+              <w:bottom w:val="single" w:color="CCCCCC" w:sz="1"/>
+              <w:right w:val="single" w:color="CCCCCC" w:sz="1"/>
+            </w:tcBorders>
+            <w:shd w:fill="F7F8FA" w:val="clear"/>
+            <w:tcMar>
+              <w:top w:type="dxa" w:w="70"/>
+              <w:left w:type="dxa" w:w="100"/>
+              <w:bottom w:type="dxa" w:w="70"/>
+              <w:right w:type="dxa" w:w="100"/>
+            </w:tcMar>
+          </w:tcPr>
+          <w:p>
+            <w:pPr>
+              <w:spacing w:after="0"/>
+            </w:pPr>
+            <w:r>
+              <w:rPr>
+                <w:rFonts w:ascii="Courier New" w:cs="Courier New" w:eastAsia="Courier New" w:hAnsi="Courier New"/>
+                <w:color w:val="333333"/>
+                <w:sz w:val="15"/>
+                <w:szCs w:val="15"/>
+              </w:rPr>
+              <w:t xml:space="preserve">contrato_equipo</w:t>
+            </w:r>
+          </w:p>
+        </w:tc>
+        <w:tc>
+          <w:tcPr>
+            <w:tcW w:type="dxa" w:w="6581"/>
+            <w:tcBorders>
+              <w:top w:val="single" w:color="CCCCCC" w:sz="1"/>
+              <w:left w:val="single" w:color="CCCCCC" w:sz="1"/>
+              <w:bottom w:val="single" w:color="CCCCCC" w:sz="1"/>
+              <w:right w:val="single" w:color="CCCCCC" w:sz="1"/>
+            </w:tcBorders>
+            <w:shd w:fill="F7F8FA" w:val="clear"/>
+            <w:tcMar>
+              <w:top w:type="dxa" w:w="70"/>
+              <w:left w:type="dxa" w:w="100"/>
+              <w:bottom w:type="dxa" w:w="70"/>
+              <w:right w:type="dxa" w:w="100"/>
+            </w:tcMar>
+          </w:tcPr>
+          <w:p>
+            <w:pPr>
+              <w:spacing w:after="0"/>
+            </w:pPr>
+            <w:r>
+              <w:rPr>
+                <w:rFonts w:ascii="Arial" w:cs="Arial" w:eastAsia="Arial" w:hAnsi="Arial"/>
+                <w:color w:val="333333"/>
+                <w:sz w:val="17"/>
+                <w:szCs w:val="17"/>
+              </w:rPr>
+              <w:t xml:space="preserve">Lo que dijo Juan David en el grupo, en inglés. Ej.: *Goodman natural-gas furnace, 80,000 BTU/h, 80% AFUE*</w:t>
+            </w:r>
+          </w:p>
+        </w:tc>
+      </w:tr>
+      <w:tr>
+        <w:trPr>
+          <w:cantSplit/>
+        </w:trPr>
+        <w:tc>
+          <w:tcPr>
+            <w:tcW w:type="dxa" w:w="3391"/>
+            <w:tcBorders>
+              <w:top w:val="single" w:color="CCCCCC" w:sz="1"/>
+              <w:left w:val="single" w:color="CCCCCC" w:sz="1"/>
+              <w:bottom w:val="single" w:color="CCCCCC" w:sz="1"/>
+              <w:right w:val="single" w:color="CCCCCC" w:sz="1"/>
+            </w:tcBorders>
+            <w:shd w:fill="FFFFFF" w:val="clear"/>
+            <w:tcMar>
+              <w:top w:type="dxa" w:w="70"/>
+              <w:left w:type="dxa" w:w="100"/>
+              <w:bottom w:type="dxa" w:w="70"/>
+              <w:right w:type="dxa" w:w="100"/>
+            </w:tcMar>
+          </w:tcPr>
+          <w:p>
+            <w:pPr>
+              <w:spacing w:after="0"/>
+            </w:pPr>
+            <w:r>
+              <w:rPr>
+                <w:rFonts w:ascii="Courier New" w:cs="Courier New" w:eastAsia="Courier New" w:hAnsi="Courier New"/>
+                <w:color w:val="333333"/>
+                <w:sz w:val="15"/>
+                <w:szCs w:val="15"/>
+              </w:rPr>
+              <w:t xml:space="preserve">contrato_precio</w:t>
+            </w:r>
+          </w:p>
+        </w:tc>
+        <w:tc>
+          <w:tcPr>
+            <w:tcW w:type="dxa" w:w="6581"/>
+            <w:tcBorders>
+              <w:top w:val="single" w:color="CCCCCC" w:sz="1"/>
+              <w:left w:val="single" w:color="CCCCCC" w:sz="1"/>
+              <w:bottom w:val="single" w:color="CCCCCC" w:sz="1"/>
+              <w:right w:val="single" w:color="CCCCCC" w:sz="1"/>
+            </w:tcBorders>
+            <w:shd w:fill="FFFFFF" w:val="clear"/>
+            <w:tcMar>
+              <w:top w:type="dxa" w:w="70"/>
+              <w:left w:type="dxa" w:w="100"/>
+              <w:bottom w:type="dxa" w:w="70"/>
+              <w:right w:type="dxa" w:w="100"/>
+            </w:tcMar>
+          </w:tcPr>
+          <w:p>
+            <w:pPr>
+              <w:spacing w:after="0"/>
+            </w:pPr>
+            <w:r>
+              <w:rPr>
+                <w:rFonts w:ascii="Arial" w:cs="Arial" w:eastAsia="Arial" w:hAnsi="Arial"/>
+                <w:color w:val="333333"/>
+                <w:sz w:val="17"/>
+                <w:szCs w:val="17"/>
+              </w:rPr>
+              <w:t xml:space="preserve">El precio exacto de Juan David (solo el número, ej. 2350)</w:t>
+            </w:r>
+          </w:p>
+        </w:tc>
+      </w:tr>
+      <w:tr>
+        <w:trPr>
+          <w:cantSplit/>
+        </w:trPr>
+        <w:tc>
+          <w:tcPr>
+            <w:tcW w:type="dxa" w:w="3391"/>
+            <w:tcBorders>
+              <w:top w:val="single" w:color="CCCCCC" w:sz="1"/>
+              <w:left w:val="single" w:color="CCCCCC" w:sz="1"/>
+              <w:bottom w:val="single" w:color="CCCCCC" w:sz="1"/>
+              <w:right w:val="single" w:color="CCCCCC" w:sz="1"/>
+            </w:tcBorders>
+            <w:shd w:fill="F7F8FA" w:val="clear"/>
+            <w:tcMar>
+              <w:top w:type="dxa" w:w="70"/>
+              <w:left w:type="dxa" w:w="100"/>
+              <w:bottom w:type="dxa" w:w="70"/>
+              <w:right w:type="dxa" w:w="100"/>
+            </w:tcMar>
+          </w:tcPr>
+          <w:p>
+            <w:pPr>
+              <w:spacing w:after="0"/>
+            </w:pPr>
+            <w:r>
+              <w:rPr>
+                <w:rFonts w:ascii="Courier New" w:cs="Courier New" w:eastAsia="Courier New" w:hAnsi="Courier New"/>
+                <w:color w:val="333333"/>
+                <w:sz w:val="15"/>
+                <w:szCs w:val="15"/>
+              </w:rPr>
+              <w:t xml:space="preserve">contrato_forma_pago</w:t>
+            </w:r>
+          </w:p>
+        </w:tc>
+        <w:tc>
+          <w:tcPr>
+            <w:tcW w:type="dxa" w:w="6581"/>
+            <w:tcBorders>
+              <w:top w:val="single" w:color="CCCCCC" w:sz="1"/>
+              <w:left w:val="single" w:color="CCCCCC" w:sz="1"/>
+              <w:bottom w:val="single" w:color="CCCCCC" w:sz="1"/>
+              <w:right w:val="single" w:color="CCCCCC" w:sz="1"/>
+            </w:tcBorders>
+            <w:shd w:fill="F7F8FA" w:val="clear"/>
+            <w:tcMar>
+              <w:top w:type="dxa" w:w="70"/>
+              <w:left w:type="dxa" w:w="100"/>
+              <w:bottom w:type="dxa" w:w="70"/>
+              <w:right w:type="dxa" w:w="100"/>
+            </w:tcMar>
+          </w:tcPr>
+          <w:p>
+            <w:pPr>
+              <w:spacing w:after="0"/>
+            </w:pPr>
+            <w:r>
+              <w:rPr>
+                <w:rFonts w:ascii="Arial" w:cs="Arial" w:eastAsia="Arial" w:hAnsi="Arial"/>
+                <w:color w:val="333333"/>
+                <w:sz w:val="17"/>
+                <w:szCs w:val="17"/>
+              </w:rPr>
+              <w:t xml:space="preserve">*Pay in full when the job is done* (vive en la casa) o *Deposit before installation, balance when the job is done* (renta o inversión)</w:t>
+            </w:r>
+          </w:p>
+        </w:tc>
+      </w:tr>
+      <w:tr>
+        <w:trPr>
+          <w:cantSplit/>
+        </w:trPr>
+        <w:tc>
+          <w:tcPr>
+            <w:tcW w:type="dxa" w:w="3391"/>
+            <w:tcBorders>
+              <w:top w:val="single" w:color="CCCCCC" w:sz="1"/>
+              <w:left w:val="single" w:color="CCCCCC" w:sz="1"/>
+              <w:bottom w:val="single" w:color="CCCCCC" w:sz="1"/>
+              <w:right w:val="single" w:color="CCCCCC" w:sz="1"/>
+            </w:tcBorders>
+            <w:shd w:fill="FFFFFF" w:val="clear"/>
+            <w:tcMar>
+              <w:top w:type="dxa" w:w="70"/>
+              <w:left w:type="dxa" w:w="100"/>
+              <w:bottom w:type="dxa" w:w="70"/>
+              <w:right w:type="dxa" w:w="100"/>
+            </w:tcMar>
+          </w:tcPr>
+          <w:p>
+            <w:pPr>
+              <w:spacing w:after="0"/>
+            </w:pPr>
+            <w:r>
+              <w:rPr>
+                <w:rFonts w:ascii="Courier New" w:cs="Courier New" w:eastAsia="Courier New" w:hAnsi="Courier New"/>
+                <w:color w:val="333333"/>
+                <w:sz w:val="15"/>
+                <w:szCs w:val="15"/>
+              </w:rPr>
+              <w:t xml:space="preserve">contrato_anticipo</w:t>
+            </w:r>
+          </w:p>
+        </w:tc>
+        <w:tc>
+          <w:tcPr>
+            <w:tcW w:type="dxa" w:w="6581"/>
+            <w:tcBorders>
+              <w:top w:val="single" w:color="CCCCCC" w:sz="1"/>
+              <w:left w:val="single" w:color="CCCCCC" w:sz="1"/>
+              <w:bottom w:val="single" w:color="CCCCCC" w:sz="1"/>
+              <w:right w:val="single" w:color="CCCCCC" w:sz="1"/>
+            </w:tcBorders>
+            <w:shd w:fill="FFFFFF" w:val="clear"/>
+            <w:tcMar>
+              <w:top w:type="dxa" w:w="70"/>
+              <w:left w:type="dxa" w:w="100"/>
+              <w:bottom w:type="dxa" w:w="70"/>
+              <w:right w:type="dxa" w:w="100"/>
+            </w:tcMar>
+          </w:tcPr>
+          <w:p>
+            <w:pPr>
+              <w:spacing w:after="0"/>
+            </w:pPr>
+            <w:r>
+              <w:rPr>
+                <w:rFonts w:ascii="Arial" w:cs="Arial" w:eastAsia="Arial" w:hAnsi="Arial"/>
+                <w:b/>
+                <w:bCs/>
+                <w:color w:val="333333"/>
+                <w:sz w:val="17"/>
+                <w:szCs w:val="17"/>
+              </w:rPr>
+              <w:t xml:space="preserve">0</w:t>
+            </w:r>
+            <w:r>
+              <w:rPr>
+                <w:rFonts w:ascii="Arial" w:cs="Arial" w:eastAsia="Arial" w:hAnsi="Arial"/>
+                <w:color w:val="333333"/>
+                <w:sz w:val="17"/>
+                <w:szCs w:val="17"/>
+              </w:rPr>
+              <w:t xml:space="preserve"> si paga al terminar; si es renta o inversión, el monto que diga Juan David</w:t>
+            </w:r>
+          </w:p>
+        </w:tc>
+      </w:tr>
+      <w:tr>
+        <w:trPr>
+          <w:cantSplit/>
+        </w:trPr>
+        <w:tc>
+          <w:tcPr>
+            <w:tcW w:type="dxa" w:w="3391"/>
+            <w:tcBorders>
+              <w:top w:val="single" w:color="CCCCCC" w:sz="1"/>
+              <w:left w:val="single" w:color="CCCCCC" w:sz="1"/>
+              <w:bottom w:val="single" w:color="CCCCCC" w:sz="1"/>
+              <w:right w:val="single" w:color="CCCCCC" w:sz="1"/>
+            </w:tcBorders>
+            <w:shd w:fill="F7F8FA" w:val="clear"/>
+            <w:tcMar>
+              <w:top w:type="dxa" w:w="70"/>
+              <w:left w:type="dxa" w:w="100"/>
+              <w:bottom w:type="dxa" w:w="70"/>
+              <w:right w:type="dxa" w:w="100"/>
+            </w:tcMar>
+          </w:tcPr>
+          <w:p>
+            <w:pPr>
+              <w:spacing w:after="0"/>
+            </w:pPr>
+            <w:r>
+              <w:rPr>
+                <w:rFonts w:ascii="Courier New" w:cs="Courier New" w:eastAsia="Courier New" w:hAnsi="Courier New"/>
+                <w:color w:val="333333"/>
+                <w:sz w:val="15"/>
+                <w:szCs w:val="15"/>
+              </w:rPr>
+              <w:t xml:space="preserve">contrato_fecha_instalacion</w:t>
+            </w:r>
+          </w:p>
+        </w:tc>
+        <w:tc>
+          <w:tcPr>
+            <w:tcW w:type="dxa" w:w="6581"/>
+            <w:tcBorders>
+              <w:top w:val="single" w:color="CCCCCC" w:sz="1"/>
+              <w:left w:val="single" w:color="CCCCCC" w:sz="1"/>
+              <w:bottom w:val="single" w:color="CCCCCC" w:sz="1"/>
+              <w:right w:val="single" w:color="CCCCCC" w:sz="1"/>
+            </w:tcBorders>
+            <w:shd w:fill="F7F8FA" w:val="clear"/>
+            <w:tcMar>
+              <w:top w:type="dxa" w:w="70"/>
+              <w:left w:type="dxa" w:w="100"/>
+              <w:bottom w:type="dxa" w:w="70"/>
+              <w:right w:type="dxa" w:w="100"/>
+            </w:tcMar>
+          </w:tcPr>
+          <w:p>
+            <w:pPr>
+              <w:spacing w:after="0"/>
+            </w:pPr>
+            <w:r>
+              <w:rPr>
+                <w:rFonts w:ascii="Arial" w:cs="Arial" w:eastAsia="Arial" w:hAnsi="Arial"/>
+                <w:color w:val="333333"/>
+                <w:sz w:val="17"/>
+                <w:szCs w:val="17"/>
+              </w:rPr>
+              <w:t xml:space="preserve">El día que escogió</w:t>
+            </w:r>
+          </w:p>
+        </w:tc>
+      </w:tr>
+    </w:tbl>
+    <w:p>
+      <w:pPr>
+        <w:spacing w:after="160"/>
+      </w:pPr>
+      <w:r>
+        <w:t xml:space="preserve"/>
+      </w:r>
+    </w:p>
+    <w:p>
+      <w:pPr>
+        <w:spacing w:after="110"/>
+      </w:pPr>
+      <w:r>
+        <w:rPr>
+          <w:rFonts w:ascii="Arial" w:cs="Arial" w:eastAsia="Arial" w:hAnsi="Arial"/>
+          <w:color w:val="333333"/>
+          <w:sz w:val="20"/>
+          <w:szCs w:val="20"/>
+        </w:rPr>
+        <w:t xml:space="preserve">Después mueves la oportunidad a </w:t>
+      </w:r>
+      <w:r>
+        <w:rPr>
+          <w:rFonts w:ascii="Arial" w:cs="Arial" w:eastAsia="Arial" w:hAnsi="Arial"/>
+          <w:b/>
+          <w:bCs/>
+          <w:color w:val="333333"/>
+          <w:sz w:val="20"/>
+          <w:szCs w:val="20"/>
+        </w:rPr>
+        <w:t xml:space="preserve">Proposal Sent</w:t>
+      </w:r>
+      <w:r>
+        <w:rPr>
+          <w:rFonts w:ascii="Arial" w:cs="Arial" w:eastAsia="Arial" w:hAnsi="Arial"/>
+          <w:color w:val="333333"/>
+          <w:sz w:val="20"/>
+          <w:szCs w:val="20"/>
+        </w:rPr>
+        <w:t xml:space="preserve"> con el valor. El sistema le manda el contrato por texto para firmar, y Juan David lo contrafirma. Si falta uno de los 3 primeros campos o el anticipo, </w:t>
+      </w:r>
+      <w:r>
+        <w:rPr>
+          <w:rFonts w:ascii="Arial" w:cs="Arial" w:eastAsia="Arial" w:hAnsi="Arial"/>
+          <w:b/>
+          <w:bCs/>
+          <w:color w:val="333333"/>
+          <w:sz w:val="20"/>
+          <w:szCs w:val="20"/>
+        </w:rPr>
+        <w:t xml:space="preserve">no sale</w:t>
+      </w:r>
+      <w:r>
+        <w:rPr>
+          <w:rFonts w:ascii="Arial" w:cs="Arial" w:eastAsia="Arial" w:hAnsi="Arial"/>
+          <w:color w:val="333333"/>
+          <w:sz w:val="20"/>
+          <w:szCs w:val="20"/>
+        </w:rPr>
+        <w:t xml:space="preserve">: revisa que estén todos.</w:t>
       </w:r>
     </w:p>
     <w:p>
@@ -3766,22 +4335,11 @@
       <w:r>
         <w:rPr>
           <w:rFonts w:ascii="Arial" w:cs="Arial" w:eastAsia="Arial" w:hAnsi="Arial"/>
-          <w:b/>
-          <w:bCs/>
-          <w:color w:val="333333"/>
-          <w:sz w:val="20"/>
-          <w:szCs w:val="20"/>
-        </w:rPr>
-        <w:t xml:space="preserve">El contrato se manda en esta llamada</w:t>
-      </w:r>
-      <w:r>
-        <w:rPr>
-          <w:rFonts w:ascii="Arial" w:cs="Arial" w:eastAsia="Arial" w:hAnsi="Arial"/>
-          <w:color w:val="333333"/>
-          <w:sz w:val="20"/>
-          <w:szCs w:val="20"/>
-        </w:rPr>
-        <w:t xml:space="preserve"> (link de GHL al correo) para que lo firme antes del día de instalación: así Juan David</w:t>
+          <w:color w:val="333333"/>
+          <w:sz w:val="20"/>
+          <w:szCs w:val="20"/>
+        </w:rPr>
+        <w:t xml:space="preserve">Si no acepta mensajes de texto: pide el correo y avisa en el grupo; el contrato se manda a mano por correo desde GHL</w:t>
       </w:r>
     </w:p>
     <w:p>
@@ -3795,27 +4353,7 @@
           <w:sz w:val="20"/>
           <w:szCs w:val="20"/>
         </w:rPr>
-        <w:t xml:space="preserve">  sabe que la venta es en firme antes de cargar el furnace. Si no lo puede firmar en el celular: por correo, o en papel en la casa </w:t>
-      </w:r>
-      <w:r>
-        <w:rPr>
-          <w:rFonts w:ascii="Arial" w:cs="Arial" w:eastAsia="Arial" w:hAnsi="Arial"/>
-          <w:b/>
-          <w:bCs/>
-          <w:color w:val="333333"/>
-          <w:sz w:val="20"/>
-          <w:szCs w:val="20"/>
-        </w:rPr>
-        <w:t xml:space="preserve">antes de empezar el trabajo</w:t>
-      </w:r>
-      <w:r>
-        <w:rPr>
-          <w:rFonts w:ascii="Arial" w:cs="Arial" w:eastAsia="Arial" w:hAnsi="Arial"/>
-          <w:color w:val="333333"/>
-          <w:sz w:val="20"/>
-          <w:szCs w:val="20"/>
-        </w:rPr>
-        <w:t xml:space="preserve">. Nunca se empieza a trabajar sin contrato firmado (Juan David, 19-oct).</w:t>
+        <w:t xml:space="preserve">  (Documents &amp; Contracts → plantilla "Contrato - Reemplazo de furnace (venta directa)").</w:t>
       </w:r>
     </w:p>
     <w:p>
@@ -3841,6 +4379,86 @@
           <w:sz w:val="20"/>
           <w:szCs w:val="20"/>
         </w:rPr>
+        <w:t xml:space="preserve">El contrato se firma </w:t>
+      </w:r>
+      <w:r>
+        <w:rPr>
+          <w:rFonts w:ascii="Arial" w:cs="Arial" w:eastAsia="Arial" w:hAnsi="Arial"/>
+          <w:b/>
+          <w:bCs/>
+          <w:color w:val="333333"/>
+          <w:sz w:val="20"/>
+          <w:szCs w:val="20"/>
+        </w:rPr>
+        <w:t xml:space="preserve">antes del día de instalación</w:t>
+      </w:r>
+      <w:r>
+        <w:rPr>
+          <w:rFonts w:ascii="Arial" w:cs="Arial" w:eastAsia="Arial" w:hAnsi="Arial"/>
+          <w:color w:val="333333"/>
+          <w:sz w:val="20"/>
+          <w:szCs w:val="20"/>
+        </w:rPr>
+        <w:t xml:space="preserve">: así Juan David sabe que la venta es en firme antes de cargar el furnace.</w:t>
+      </w:r>
+    </w:p>
+    <w:p>
+      <w:pPr>
+        <w:spacing w:after="110"/>
+      </w:pPr>
+      <w:r>
+        <w:rPr>
+          <w:rFonts w:ascii="Arial" w:cs="Arial" w:eastAsia="Arial" w:hAnsi="Arial"/>
+          <w:color w:val="333333"/>
+          <w:sz w:val="20"/>
+          <w:szCs w:val="20"/>
+        </w:rPr>
+        <w:t xml:space="preserve">  Si no lo puede firmar en el celular: en papel en la casa </w:t>
+      </w:r>
+      <w:r>
+        <w:rPr>
+          <w:rFonts w:ascii="Arial" w:cs="Arial" w:eastAsia="Arial" w:hAnsi="Arial"/>
+          <w:b/>
+          <w:bCs/>
+          <w:color w:val="333333"/>
+          <w:sz w:val="20"/>
+          <w:szCs w:val="20"/>
+        </w:rPr>
+        <w:t xml:space="preserve">antes de empezar el trabajo</w:t>
+      </w:r>
+      <w:r>
+        <w:rPr>
+          <w:rFonts w:ascii="Arial" w:cs="Arial" w:eastAsia="Arial" w:hAnsi="Arial"/>
+          <w:color w:val="333333"/>
+          <w:sz w:val="20"/>
+          <w:szCs w:val="20"/>
+        </w:rPr>
+        <w:t xml:space="preserve">. Nunca se empieza a trabajar sin contrato firmado (Juan David, 19-oct).</w:t>
+      </w:r>
+    </w:p>
+    <w:p>
+      <w:pPr>
+        <w:spacing w:after="50"/>
+        <w:ind w:left="360" w:hanging="240"/>
+      </w:pPr>
+      <w:r>
+        <w:rPr>
+          <w:rFonts w:ascii="Arial" w:cs="Arial" w:eastAsia="Arial" w:hAnsi="Arial"/>
+          <w:b/>
+          <w:bCs/>
+          <w:color w:val="2E75B6"/>
+          <w:sz w:val="20"/>
+          <w:szCs w:val="20"/>
+        </w:rPr>
+        <w:t xml:space="preserve">• </w:t>
+      </w:r>
+      <w:r>
+        <w:rPr>
+          <w:rFonts w:ascii="Arial" w:cs="Arial" w:eastAsia="Arial" w:hAnsi="Arial"/>
+          <w:color w:val="333333"/>
+          <w:sz w:val="20"/>
+          <w:szCs w:val="20"/>
+        </w:rPr>
         <w:t xml:space="preserve">La instalación va al calendario como </w:t>
       </w:r>
       <w:r>
@@ -3861,41 +4479,7 @@
           <w:sz w:val="20"/>
           <w:szCs w:val="20"/>
         </w:rPr>
-        <w:t xml:space="preserve">, con dirección completa, y la oportunidad pasa a</w:t>
-      </w:r>
-    </w:p>
-    <w:p>
-      <w:pPr>
-        <w:spacing w:after="110"/>
-      </w:pPr>
-      <w:r>
-        <w:rPr>
-          <w:rFonts w:ascii="Arial" w:cs="Arial" w:eastAsia="Arial" w:hAnsi="Arial"/>
-          <w:color w:val="333333"/>
-          <w:sz w:val="20"/>
-          <w:szCs w:val="20"/>
-        </w:rPr>
-        <w:t xml:space="preserve">  </w:t>
-      </w:r>
-      <w:r>
-        <w:rPr>
-          <w:rFonts w:ascii="Arial" w:cs="Arial" w:eastAsia="Arial" w:hAnsi="Arial"/>
-          <w:b/>
-          <w:bCs/>
-          <w:color w:val="333333"/>
-          <w:sz w:val="20"/>
-          <w:szCs w:val="20"/>
-        </w:rPr>
-        <w:t xml:space="preserve">Proposal Sent</w:t>
-      </w:r>
-      <w:r>
-        <w:rPr>
-          <w:rFonts w:ascii="Arial" w:cs="Arial" w:eastAsia="Arial" w:hAnsi="Arial"/>
-          <w:color w:val="333333"/>
-          <w:sz w:val="20"/>
-          <w:szCs w:val="20"/>
-        </w:rPr>
-        <w:t xml:space="preserve"> con el valor.</w:t>
+        <w:t xml:space="preserve">, con dirección completa.</w:t>
       </w:r>
     </w:p>
     <w:p>

</xml_diff>

<commit_message>
Aire Express setter: contract requires all 5 fields
Co-Authored-By: Claude Opus 5.5 <noreply@anthropic.com>
</commit_message>
<xml_diff>
--- a/induccion-aire-express/guiones/docs/01_SPEECH_CONTACTABILIDAD.docx
+++ b/induccion-aire-express/guiones/docs/01_SPEECH_CONTACTABILIDAD.docx
@@ -4293,7 +4293,27 @@
           <w:sz w:val="20"/>
           <w:szCs w:val="20"/>
         </w:rPr>
-        <w:t xml:space="preserve"> con el valor. El sistema le manda el contrato por texto para firmar, y Juan David lo contrafirma. Si falta uno de los 3 primeros campos o el anticipo, </w:t>
+        <w:t xml:space="preserve"> con el valor. El sistema le manda el contrato por texto para firmar, y Juan David lo contrafirma. Si falta </w:t>
+      </w:r>
+      <w:r>
+        <w:rPr>
+          <w:rFonts w:ascii="Arial" w:cs="Arial" w:eastAsia="Arial" w:hAnsi="Arial"/>
+          <w:b/>
+          <w:bCs/>
+          <w:color w:val="333333"/>
+          <w:sz w:val="20"/>
+          <w:szCs w:val="20"/>
+        </w:rPr>
+        <w:t xml:space="preserve">cualquiera de los 5 campos</w:t>
+      </w:r>
+      <w:r>
+        <w:rPr>
+          <w:rFonts w:ascii="Arial" w:cs="Arial" w:eastAsia="Arial" w:hAnsi="Arial"/>
+          <w:color w:val="333333"/>
+          <w:sz w:val="20"/>
+          <w:szCs w:val="20"/>
+        </w:rPr>
+        <w:t xml:space="preserve">, el contrato </w:t>
       </w:r>
       <w:r>
         <w:rPr>
@@ -4313,7 +4333,7 @@
           <w:sz w:val="20"/>
           <w:szCs w:val="20"/>
         </w:rPr>
-        <w:t xml:space="preserve">: revisa que estén todos.</w:t>
+        <w:t xml:space="preserve">: revisa que estén todos (el anticipo en 0 también cuenta).</w:t>
       </w:r>
     </w:p>
     <w:p>

</xml_diff>

<commit_message>
Aire Express setter: manual contract is sent by Juan David from his user
Co-Authored-By: Claude Opus 5.5 <noreply@anthropic.com>
</commit_message>
<xml_diff>
--- a/induccion-aire-express/guiones/docs/01_SPEECH_CONTACTABILIDAD.docx
+++ b/induccion-aire-express/guiones/docs/01_SPEECH_CONTACTABILIDAD.docx
@@ -4359,7 +4359,27 @@
           <w:sz w:val="20"/>
           <w:szCs w:val="20"/>
         </w:rPr>
-        <w:t xml:space="preserve">Si no acepta mensajes de texto: pide el correo y avisa en el grupo; el contrato se manda a mano por correo desde GHL</w:t>
+        <w:t xml:space="preserve">Si no acepta mensajes de texto: pide el correo y avisa en el grupo. </w:t>
+      </w:r>
+      <w:r>
+        <w:rPr>
+          <w:rFonts w:ascii="Arial" w:cs="Arial" w:eastAsia="Arial" w:hAnsi="Arial"/>
+          <w:b/>
+          <w:bCs/>
+          <w:color w:val="333333"/>
+          <w:sz w:val="20"/>
+          <w:szCs w:val="20"/>
+        </w:rPr>
+        <w:t xml:space="preserve">Tú no mandas el contrato a mano</w:t>
+      </w:r>
+      <w:r>
+        <w:rPr>
+          <w:rFonts w:ascii="Arial" w:cs="Arial" w:eastAsia="Arial" w:hAnsi="Arial"/>
+          <w:color w:val="333333"/>
+          <w:sz w:val="20"/>
+          <w:szCs w:val="20"/>
+        </w:rPr>
+        <w:t xml:space="preserve"> (quien lo envía queda como</w:t>
       </w:r>
     </w:p>
     <w:p>
@@ -4373,7 +4393,27 @@
           <w:sz w:val="20"/>
           <w:szCs w:val="20"/>
         </w:rPr>
-        <w:t xml:space="preserve">  (Documents &amp; Contracts → plantilla "Contrato - Reemplazo de furnace (venta directa)").</w:t>
+        <w:t xml:space="preserve">  firmante del contratista): lo manda </w:t>
+      </w:r>
+      <w:r>
+        <w:rPr>
+          <w:rFonts w:ascii="Arial" w:cs="Arial" w:eastAsia="Arial" w:hAnsi="Arial"/>
+          <w:b/>
+          <w:bCs/>
+          <w:color w:val="333333"/>
+          <w:sz w:val="20"/>
+          <w:szCs w:val="20"/>
+        </w:rPr>
+        <w:t xml:space="preserve">Juan David desde su usuario</w:t>
+      </w:r>
+      <w:r>
+        <w:rPr>
+          <w:rFonts w:ascii="Arial" w:cs="Arial" w:eastAsia="Arial" w:hAnsi="Arial"/>
+          <w:color w:val="333333"/>
+          <w:sz w:val="20"/>
+          <w:szCs w:val="20"/>
+        </w:rPr>
+        <w:t xml:space="preserve"> por correo (Documents &amp; Contracts → plantilla "Contrato - Reemplazo de furnace (venta directa)" → cliente → Send), así firma él.</w:t>
       </w:r>
     </w:p>
     <w:p>

</xml_diff>

<commit_message>
Aire Express: regla de reparación (25 millas sin costo, $60 de diagnóstico más lejos si no se repara)
Co-Authored-By: Claude Opus 5.5 <noreply@anthropic.com>
</commit_message>
<xml_diff>
--- a/induccion-aire-express/guiones/docs/01_SPEECH_CONTACTABILIDAD.docx
+++ b/induccion-aire-express/guiones/docs/01_SPEECH_CONTACTABILIDAD.docx
@@ -5229,6 +5229,57 @@
           <w:sz w:val="17"/>
           <w:szCs w:val="17"/>
         </w:rPr>
+        <w:t xml:space="preserve">Antes de los horarios, revisa la distancia de la dirección a Columbus. Más de 25 millas: di la línea del diagnóstico.</w:t>
+      </w:r>
+    </w:p>
+    <w:p>
+      <w:pPr>
+        <w:keepLines/>
+        <w:shd w:fill="F2F4F7" w:val="clear"/>
+        <w:spacing w:after="0"/>
+        <w:ind w:left="100" w:right="100"/>
+      </w:pPr>
+      <w:r>
+        <w:rPr>
+          <w:rFonts w:ascii="Courier New" w:cs="Courier New" w:eastAsia="Courier New" w:hAnsi="Courier New"/>
+          <w:color w:val="1B2A4A"/>
+          <w:sz w:val="17"/>
+          <w:szCs w:val="17"/>
+        </w:rPr>
+        <w:t xml:space="preserve">"Since you're more than 25 miles from Columbus, there's a $60 diagnostic fee only if you decide not to do the repair. If we fix it, you only pay for the repair." ← solo de 25 a 70 millas</w:t>
+      </w:r>
+    </w:p>
+    <w:p>
+      <w:pPr>
+        <w:keepLines/>
+        <w:shd w:fill="F2F4F7" w:val="clear"/>
+        <w:spacing w:after="0"/>
+        <w:ind w:left="100" w:right="100"/>
+      </w:pPr>
+      <w:r>
+        <w:rPr>
+          <w:rFonts w:ascii="Courier New" w:cs="Courier New" w:eastAsia="Courier New" w:hAnsi="Courier New"/>
+          <w:color w:val="1B2A4A"/>
+          <w:sz w:val="17"/>
+          <w:szCs w:val="17"/>
+        </w:rPr>
+        <w:t xml:space="preserve">(Como estás a más de 25 millas de Columbus, el diagnóstico cuesta $60 solo si decides no hacer la reparación. Si la hacemos, solo pagas la reparación.)</w:t>
+      </w:r>
+    </w:p>
+    <w:p>
+      <w:pPr>
+        <w:keepLines/>
+        <w:shd w:fill="F2F4F7" w:val="clear"/>
+        <w:spacing w:after="0"/>
+        <w:ind w:left="100" w:right="100"/>
+      </w:pPr>
+      <w:r>
+        <w:rPr>
+          <w:rFonts w:ascii="Courier New" w:cs="Courier New" w:eastAsia="Courier New" w:hAnsi="Courier New"/>
+          <w:color w:val="1B2A4A"/>
+          <w:sz w:val="17"/>
+          <w:szCs w:val="17"/>
+        </w:rPr>
         <w:t xml:space="preserve">"We find the problem first and repair it — no pressure to replace. We can come [Day] at [time] or [Day] at [time]. Which one works?"</w:t>
       </w:r>
     </w:p>

</xml_diff>